<commit_message>
creado formulario para el cambio de contraseñas también el modulo de configuración de empleados
</commit_message>
<xml_diff>
--- a/Memoria.docx
+++ b/Memoria.docx
@@ -193,9 +193,11 @@
           <w:pPr>
             <w:pStyle w:val="TOCHeading"/>
           </w:pPr>
+          <w:proofErr w:type="spellStart"/>
           <w:r>
             <w:t>Índice</w:t>
           </w:r>
+          <w:proofErr w:type="spellEnd"/>
         </w:p>
         <w:p>
           <w:pPr>
@@ -2249,11 +2251,33 @@
           <w:lang w:val="es-ES"/>
         </w:rPr>
       </w:pPr>
-      <w:r>
-        <w:rPr>
-          <w:lang w:val="es-ES"/>
-        </w:rPr>
-        <w:t>AppRRHH es una aplicación de escritorio desarrollada en C# con Windows Forms cuyo objetivo es centralizar y automatizar las tareas propias de un departamento de Recursos Humanos. El sistema permite gestionar empleados, departamentos, nóminas y vacaciones desde una interfaz gráfica intuitiva, con acceso diferenciado según el rol del usuario</w:t>
+      <w:proofErr w:type="spellStart"/>
+      <w:r>
+        <w:rPr>
+          <w:lang w:val="es-ES"/>
+        </w:rPr>
+        <w:t>AppRRHH</w:t>
+      </w:r>
+      <w:proofErr w:type="spellEnd"/>
+      <w:r>
+        <w:rPr>
+          <w:lang w:val="es-ES"/>
+        </w:rPr>
+        <w:t xml:space="preserve"> es una aplicación de escritorio desarrollada en C# con Windows </w:t>
+      </w:r>
+      <w:proofErr w:type="spellStart"/>
+      <w:r>
+        <w:rPr>
+          <w:lang w:val="es-ES"/>
+        </w:rPr>
+        <w:t>Forms</w:t>
+      </w:r>
+      <w:proofErr w:type="spellEnd"/>
+      <w:r>
+        <w:rPr>
+          <w:lang w:val="es-ES"/>
+        </w:rPr>
+        <w:t xml:space="preserve"> cuyo objetivo es centralizar y automatizar las tareas propias de un departamento de Recursos Humanos. El sistema permite gestionar empleados, departamentos, nóminas y vacaciones desde una interfaz gráfica intuitiva, con acceso diferenciado según el rol del usuario</w:t>
       </w:r>
       <w:r>
         <w:rPr>
@@ -2275,11 +2299,19 @@
           <w:lang w:val="es-ES"/>
         </w:rPr>
       </w:pPr>
-      <w:r>
-        <w:rPr>
-          <w:lang w:val="es-ES"/>
-        </w:rPr>
-        <w:t>AppRRHH se presenta como una solución de escritorio que cubre el ciclo completo de la gestión de RRHH: desde el alta de empleados hasta la generación de nóminas en PDF, pasando por el control de fichajes en tiempo real y la gestión de soluciones de vacaciones con flujo de aprobación.</w:t>
+      <w:proofErr w:type="spellStart"/>
+      <w:r>
+        <w:rPr>
+          <w:lang w:val="es-ES"/>
+        </w:rPr>
+        <w:t>AppRRHH</w:t>
+      </w:r>
+      <w:proofErr w:type="spellEnd"/>
+      <w:r>
+        <w:rPr>
+          <w:lang w:val="es-ES"/>
+        </w:rPr>
+        <w:t xml:space="preserve"> se presenta como una solución de escritorio que cubre el ciclo completo de la gestión de RRHH: desde el alta de empleados hasta la generación de nóminas en PDF, pasando por el control de fichajes en tiempo real y la gestión de soluciones de vacaciones con flujo de aprobación.</w:t>
       </w:r>
     </w:p>
     <w:p>
@@ -2335,7 +2367,25 @@
           <w:color w:val="2C2C2C"/>
           <w:lang w:val="es-ES"/>
         </w:rPr>
-        <w:t>Desarrollar una aplicación de escritorio en C# .NET 8 con Windows Forms que centralice la gestión de RRHH de una empresa, cubriendo los módulos de empleados, nóminas, vacaciones y asistencia, con acceso diferenciado por rol.</w:t>
+        <w:t xml:space="preserve">Desarrollar una aplicación de escritorio en C# .NET 8 con Windows </w:t>
+      </w:r>
+      <w:proofErr w:type="spellStart"/>
+      <w:r>
+        <w:rPr>
+          <w:rFonts w:asciiTheme="majorHAnsi" w:eastAsia="Arial" w:hAnsiTheme="majorHAnsi" w:cstheme="majorHAnsi"/>
+          <w:color w:val="2C2C2C"/>
+          <w:lang w:val="es-ES"/>
+        </w:rPr>
+        <w:t>Forms</w:t>
+      </w:r>
+      <w:proofErr w:type="spellEnd"/>
+      <w:r>
+        <w:rPr>
+          <w:rFonts w:asciiTheme="majorHAnsi" w:eastAsia="Arial" w:hAnsiTheme="majorHAnsi" w:cstheme="majorHAnsi"/>
+          <w:color w:val="2C2C2C"/>
+          <w:lang w:val="es-ES"/>
+        </w:rPr>
+        <w:t xml:space="preserve"> que centralice la gestión de RRHH de una empresa, cubriendo los módulos de empleados, nóminas, vacaciones y asistencia, con acceso diferenciado por rol.</w:t>
       </w:r>
     </w:p>
     <w:p>
@@ -2438,7 +2488,25 @@
           <w:color w:val="2C2C2C"/>
           <w:lang w:val="es-ES"/>
         </w:rPr>
-        <w:t>Generar nóminas en formato PDF mediante QuestPDF, con diseño profesional que incluya los datos del empleado, empresa y todos los conceptos salariales desglosados.</w:t>
+        <w:t xml:space="preserve">Generar nóminas en formato PDF mediante </w:t>
+      </w:r>
+      <w:proofErr w:type="spellStart"/>
+      <w:r>
+        <w:rPr>
+          <w:rFonts w:asciiTheme="majorHAnsi" w:eastAsia="Arial" w:hAnsiTheme="majorHAnsi" w:cstheme="majorHAnsi"/>
+          <w:color w:val="2C2C2C"/>
+          <w:lang w:val="es-ES"/>
+        </w:rPr>
+        <w:t>QuestPDF</w:t>
+      </w:r>
+      <w:proofErr w:type="spellEnd"/>
+      <w:r>
+        <w:rPr>
+          <w:rFonts w:asciiTheme="majorHAnsi" w:eastAsia="Arial" w:hAnsiTheme="majorHAnsi" w:cstheme="majorHAnsi"/>
+          <w:color w:val="2C2C2C"/>
+          <w:lang w:val="es-ES"/>
+        </w:rPr>
+        <w:t>, con diseño profesional que incluya los datos del empleado, empresa y todos los conceptos salariales desglosados.</w:t>
       </w:r>
     </w:p>
     <w:p>
@@ -2530,7 +2598,21 @@
         <w:rPr>
           <w:lang w:val="es-ES"/>
         </w:rPr>
-        <w:t>Persistir todos los datos en una base de datos SQL Server gestionada mediante Entity Framework Core.</w:t>
+        <w:t xml:space="preserve">Persistir todos los datos en una base de datos SQL Server gestionada mediante </w:t>
+      </w:r>
+      <w:proofErr w:type="spellStart"/>
+      <w:r>
+        <w:rPr>
+          <w:lang w:val="es-ES"/>
+        </w:rPr>
+        <w:t>Entity</w:t>
+      </w:r>
+      <w:proofErr w:type="spellEnd"/>
+      <w:r>
+        <w:rPr>
+          <w:lang w:val="es-ES"/>
+        </w:rPr>
+        <w:t xml:space="preserve"> Framework Core.</w:t>
       </w:r>
     </w:p>
     <w:p>
@@ -2617,7 +2699,25 @@
           <w:color w:val="2C2C2C"/>
           <w:lang w:val="es-ES"/>
         </w:rPr>
-        <w:t>La aplicación está desarrollada en C# sobre la plataforma .NET 8, la versión LTS más reciente de Microsoft. .NET 8 ofrece mejoras de rendimiento significativas respecto a versiones anteriores, soporte multiplataforma y un ecosistema de paquetes NuGet muy maduro.</w:t>
+        <w:t xml:space="preserve">La aplicación está desarrollada en C# sobre la plataforma .NET 8, la versión LTS más reciente de Microsoft. .NET 8 ofrece mejoras de rendimiento significativas respecto a versiones anteriores, soporte multiplataforma y un ecosistema de paquetes </w:t>
+      </w:r>
+      <w:proofErr w:type="spellStart"/>
+      <w:r>
+        <w:rPr>
+          <w:rFonts w:asciiTheme="majorHAnsi" w:eastAsia="Arial" w:hAnsiTheme="majorHAnsi" w:cstheme="majorHAnsi"/>
+          <w:color w:val="2C2C2C"/>
+          <w:lang w:val="es-ES"/>
+        </w:rPr>
+        <w:t>NuGet</w:t>
+      </w:r>
+      <w:proofErr w:type="spellEnd"/>
+      <w:r>
+        <w:rPr>
+          <w:rFonts w:asciiTheme="majorHAnsi" w:eastAsia="Arial" w:hAnsiTheme="majorHAnsi" w:cstheme="majorHAnsi"/>
+          <w:color w:val="2C2C2C"/>
+          <w:lang w:val="es-ES"/>
+        </w:rPr>
+        <w:t xml:space="preserve"> muy maduro.</w:t>
       </w:r>
     </w:p>
     <w:p>
@@ -2639,7 +2739,23 @@
           <w:rFonts w:asciiTheme="majorHAnsi" w:eastAsia="Arial" w:hAnsiTheme="majorHAnsi" w:cstheme="majorHAnsi"/>
           <w:color w:val="2C2C2C"/>
         </w:rPr>
-        <w:t>Lenguaje: C# 12, con soporte para nullable reference types, pattern matching y records.</w:t>
+        <w:t xml:space="preserve">Lenguaje: C# 12, con </w:t>
+      </w:r>
+      <w:proofErr w:type="spellStart"/>
+      <w:r>
+        <w:rPr>
+          <w:rFonts w:asciiTheme="majorHAnsi" w:eastAsia="Arial" w:hAnsiTheme="majorHAnsi" w:cstheme="majorHAnsi"/>
+          <w:color w:val="2C2C2C"/>
+        </w:rPr>
+        <w:t>soporte</w:t>
+      </w:r>
+      <w:proofErr w:type="spellEnd"/>
+      <w:r>
+        <w:rPr>
+          <w:rFonts w:asciiTheme="majorHAnsi" w:eastAsia="Arial" w:hAnsiTheme="majorHAnsi" w:cstheme="majorHAnsi"/>
+          <w:color w:val="2C2C2C"/>
+        </w:rPr>
+        <w:t xml:space="preserve"> para nullable reference types, pattern matching y records.</w:t>
       </w:r>
     </w:p>
     <w:p>
@@ -2685,13 +2801,23 @@
           <w:szCs w:val="28"/>
         </w:rPr>
       </w:pPr>
+      <w:proofErr w:type="spellStart"/>
       <w:r>
         <w:rPr>
           <w:b/>
           <w:sz w:val="28"/>
           <w:szCs w:val="28"/>
         </w:rPr>
-        <w:t xml:space="preserve">Interfaz: </w:t>
+        <w:t>Interfaz</w:t>
+      </w:r>
+      <w:proofErr w:type="spellEnd"/>
+      <w:r>
+        <w:rPr>
+          <w:b/>
+          <w:sz w:val="28"/>
+          <w:szCs w:val="28"/>
+        </w:rPr>
+        <w:t xml:space="preserve">: </w:t>
       </w:r>
       <w:r>
         <w:rPr>
@@ -2717,7 +2843,43 @@
           <w:color w:val="2C2C2C"/>
           <w:lang w:val="es-ES"/>
         </w:rPr>
-        <w:t>Se utiliza Windows Forms como framework de interfaz gráfica de usuario. WinForms es el sistema de UI de escritorio más establecido en el ecosistema .NET y permite un desarrollo rápido de aplicaciones de negocio con amplio soporte de componentes.</w:t>
+        <w:t xml:space="preserve">Se utiliza Windows </w:t>
+      </w:r>
+      <w:proofErr w:type="spellStart"/>
+      <w:r>
+        <w:rPr>
+          <w:rFonts w:asciiTheme="majorHAnsi" w:eastAsia="Arial" w:hAnsiTheme="majorHAnsi" w:cstheme="majorHAnsi"/>
+          <w:color w:val="2C2C2C"/>
+          <w:lang w:val="es-ES"/>
+        </w:rPr>
+        <w:t>Forms</w:t>
+      </w:r>
+      <w:proofErr w:type="spellEnd"/>
+      <w:r>
+        <w:rPr>
+          <w:rFonts w:asciiTheme="majorHAnsi" w:eastAsia="Arial" w:hAnsiTheme="majorHAnsi" w:cstheme="majorHAnsi"/>
+          <w:color w:val="2C2C2C"/>
+          <w:lang w:val="es-ES"/>
+        </w:rPr>
+        <w:t xml:space="preserve"> como </w:t>
+      </w:r>
+      <w:proofErr w:type="spellStart"/>
+      <w:r>
+        <w:rPr>
+          <w:rFonts w:asciiTheme="majorHAnsi" w:eastAsia="Arial" w:hAnsiTheme="majorHAnsi" w:cstheme="majorHAnsi"/>
+          <w:color w:val="2C2C2C"/>
+          <w:lang w:val="es-ES"/>
+        </w:rPr>
+        <w:t>framework</w:t>
+      </w:r>
+      <w:proofErr w:type="spellEnd"/>
+      <w:r>
+        <w:rPr>
+          <w:rFonts w:asciiTheme="majorHAnsi" w:eastAsia="Arial" w:hAnsiTheme="majorHAnsi" w:cstheme="majorHAnsi"/>
+          <w:color w:val="2C2C2C"/>
+          <w:lang w:val="es-ES"/>
+        </w:rPr>
+        <w:t xml:space="preserve"> de interfaz gráfica de usuario. WinForms es el sistema de UI de escritorio más establecido en el ecosistema .NET y permite un desarrollo rápido de aplicaciones de negocio con amplio soporte de componentes.</w:t>
       </w:r>
     </w:p>
     <w:p>
@@ -2741,7 +2903,43 @@
           <w:color w:val="2C2C2C"/>
           <w:lang w:val="es-ES"/>
         </w:rPr>
-        <w:t>Navegación implementada mediante UserControls cargados dinámicamente en un panel contenedor central (panelContenido), evitando la apertura de múltiples formularios.</w:t>
+        <w:t xml:space="preserve">Navegación implementada mediante </w:t>
+      </w:r>
+      <w:proofErr w:type="spellStart"/>
+      <w:r>
+        <w:rPr>
+          <w:rFonts w:asciiTheme="majorHAnsi" w:eastAsia="Arial" w:hAnsiTheme="majorHAnsi" w:cstheme="majorHAnsi"/>
+          <w:color w:val="2C2C2C"/>
+          <w:lang w:val="es-ES"/>
+        </w:rPr>
+        <w:t>UserControls</w:t>
+      </w:r>
+      <w:proofErr w:type="spellEnd"/>
+      <w:r>
+        <w:rPr>
+          <w:rFonts w:asciiTheme="majorHAnsi" w:eastAsia="Arial" w:hAnsiTheme="majorHAnsi" w:cstheme="majorHAnsi"/>
+          <w:color w:val="2C2C2C"/>
+          <w:lang w:val="es-ES"/>
+        </w:rPr>
+        <w:t xml:space="preserve"> cargados dinámicamente en un panel contenedor central (</w:t>
+      </w:r>
+      <w:proofErr w:type="spellStart"/>
+      <w:r>
+        <w:rPr>
+          <w:rFonts w:asciiTheme="majorHAnsi" w:eastAsia="Arial" w:hAnsiTheme="majorHAnsi" w:cstheme="majorHAnsi"/>
+          <w:color w:val="2C2C2C"/>
+          <w:lang w:val="es-ES"/>
+        </w:rPr>
+        <w:t>panelContenido</w:t>
+      </w:r>
+      <w:proofErr w:type="spellEnd"/>
+      <w:r>
+        <w:rPr>
+          <w:rFonts w:asciiTheme="majorHAnsi" w:eastAsia="Arial" w:hAnsiTheme="majorHAnsi" w:cstheme="majorHAnsi"/>
+          <w:color w:val="2C2C2C"/>
+          <w:lang w:val="es-ES"/>
+        </w:rPr>
+        <w:t>), evitando la apertura de múltiples formularios.</w:t>
       </w:r>
     </w:p>
     <w:p>
@@ -2765,7 +2963,43 @@
           <w:color w:val="2C2C2C"/>
           <w:lang w:val="es-ES"/>
         </w:rPr>
-        <w:t>El ID del empleado logueado se gestiona de forma global mediante Program.idEmpleadoLogueado.</w:t>
+        <w:t xml:space="preserve">El ID del empleado </w:t>
+      </w:r>
+      <w:proofErr w:type="spellStart"/>
+      <w:r>
+        <w:rPr>
+          <w:rFonts w:asciiTheme="majorHAnsi" w:eastAsia="Arial" w:hAnsiTheme="majorHAnsi" w:cstheme="majorHAnsi"/>
+          <w:color w:val="2C2C2C"/>
+          <w:lang w:val="es-ES"/>
+        </w:rPr>
+        <w:t>logueado</w:t>
+      </w:r>
+      <w:proofErr w:type="spellEnd"/>
+      <w:r>
+        <w:rPr>
+          <w:rFonts w:asciiTheme="majorHAnsi" w:eastAsia="Arial" w:hAnsiTheme="majorHAnsi" w:cstheme="majorHAnsi"/>
+          <w:color w:val="2C2C2C"/>
+          <w:lang w:val="es-ES"/>
+        </w:rPr>
+        <w:t xml:space="preserve"> se gestiona de forma global mediante </w:t>
+      </w:r>
+      <w:proofErr w:type="spellStart"/>
+      <w:r>
+        <w:rPr>
+          <w:rFonts w:asciiTheme="majorHAnsi" w:eastAsia="Arial" w:hAnsiTheme="majorHAnsi" w:cstheme="majorHAnsi"/>
+          <w:color w:val="2C2C2C"/>
+          <w:lang w:val="es-ES"/>
+        </w:rPr>
+        <w:t>Program.idEmpleadoLogueado</w:t>
+      </w:r>
+      <w:proofErr w:type="spellEnd"/>
+      <w:r>
+        <w:rPr>
+          <w:rFonts w:asciiTheme="majorHAnsi" w:eastAsia="Arial" w:hAnsiTheme="majorHAnsi" w:cstheme="majorHAnsi"/>
+          <w:color w:val="2C2C2C"/>
+          <w:lang w:val="es-ES"/>
+        </w:rPr>
+        <w:t>.</w:t>
       </w:r>
     </w:p>
     <w:p>
@@ -2815,13 +3049,113 @@
           <w:lang w:val="es-ES"/>
         </w:rPr>
       </w:pPr>
+      <w:proofErr w:type="spellStart"/>
       <w:r>
         <w:rPr>
           <w:rFonts w:asciiTheme="majorHAnsi" w:eastAsia="Arial" w:hAnsiTheme="majorHAnsi" w:cstheme="majorHAnsi"/>
           <w:color w:val="2C2C2C"/>
           <w:lang w:val="es-ES"/>
         </w:rPr>
-        <w:t>Entity Framework Core 8 actúa como ORM (Object-Relational Mapper), gestionando la persistencia de datos mediante el enfoque Code First. La clase AppDbContext centraliza el acceso a las tablas de la base de datos.</w:t>
+        <w:t>Entity</w:t>
+      </w:r>
+      <w:proofErr w:type="spellEnd"/>
+      <w:r>
+        <w:rPr>
+          <w:rFonts w:asciiTheme="majorHAnsi" w:eastAsia="Arial" w:hAnsiTheme="majorHAnsi" w:cstheme="majorHAnsi"/>
+          <w:color w:val="2C2C2C"/>
+          <w:lang w:val="es-ES"/>
+        </w:rPr>
+        <w:t xml:space="preserve"> Framework Core 8 actúa como ORM (</w:t>
+      </w:r>
+      <w:proofErr w:type="spellStart"/>
+      <w:r>
+        <w:rPr>
+          <w:rFonts w:asciiTheme="majorHAnsi" w:eastAsia="Arial" w:hAnsiTheme="majorHAnsi" w:cstheme="majorHAnsi"/>
+          <w:color w:val="2C2C2C"/>
+          <w:lang w:val="es-ES"/>
+        </w:rPr>
+        <w:t>Object-Relational</w:t>
+      </w:r>
+      <w:proofErr w:type="spellEnd"/>
+      <w:r>
+        <w:rPr>
+          <w:rFonts w:asciiTheme="majorHAnsi" w:eastAsia="Arial" w:hAnsiTheme="majorHAnsi" w:cstheme="majorHAnsi"/>
+          <w:color w:val="2C2C2C"/>
+          <w:lang w:val="es-ES"/>
+        </w:rPr>
+        <w:t xml:space="preserve"> </w:t>
+      </w:r>
+      <w:proofErr w:type="spellStart"/>
+      <w:r>
+        <w:rPr>
+          <w:rFonts w:asciiTheme="majorHAnsi" w:eastAsia="Arial" w:hAnsiTheme="majorHAnsi" w:cstheme="majorHAnsi"/>
+          <w:color w:val="2C2C2C"/>
+          <w:lang w:val="es-ES"/>
+        </w:rPr>
+        <w:t>Mapper</w:t>
+      </w:r>
+      <w:proofErr w:type="spellEnd"/>
+      <w:r>
+        <w:rPr>
+          <w:rFonts w:asciiTheme="majorHAnsi" w:eastAsia="Arial" w:hAnsiTheme="majorHAnsi" w:cstheme="majorHAnsi"/>
+          <w:color w:val="2C2C2C"/>
+          <w:lang w:val="es-ES"/>
+        </w:rPr>
+        <w:t xml:space="preserve">), gestionando la persistencia de datos mediante el enfoque </w:t>
+      </w:r>
+      <w:proofErr w:type="spellStart"/>
+      <w:r>
+        <w:rPr>
+          <w:rFonts w:asciiTheme="majorHAnsi" w:eastAsia="Arial" w:hAnsiTheme="majorHAnsi" w:cstheme="majorHAnsi"/>
+          <w:color w:val="2C2C2C"/>
+          <w:lang w:val="es-ES"/>
+        </w:rPr>
+        <w:t>Code</w:t>
+      </w:r>
+      <w:proofErr w:type="spellEnd"/>
+      <w:r>
+        <w:rPr>
+          <w:rFonts w:asciiTheme="majorHAnsi" w:eastAsia="Arial" w:hAnsiTheme="majorHAnsi" w:cstheme="majorHAnsi"/>
+          <w:color w:val="2C2C2C"/>
+          <w:lang w:val="es-ES"/>
+        </w:rPr>
+        <w:t xml:space="preserve"> </w:t>
+      </w:r>
+      <w:proofErr w:type="spellStart"/>
+      <w:r>
+        <w:rPr>
+          <w:rFonts w:asciiTheme="majorHAnsi" w:eastAsia="Arial" w:hAnsiTheme="majorHAnsi" w:cstheme="majorHAnsi"/>
+          <w:color w:val="2C2C2C"/>
+          <w:lang w:val="es-ES"/>
+        </w:rPr>
+        <w:t>First</w:t>
+      </w:r>
+      <w:proofErr w:type="spellEnd"/>
+      <w:r>
+        <w:rPr>
+          <w:rFonts w:asciiTheme="majorHAnsi" w:eastAsia="Arial" w:hAnsiTheme="majorHAnsi" w:cstheme="majorHAnsi"/>
+          <w:color w:val="2C2C2C"/>
+          <w:lang w:val="es-ES"/>
+        </w:rPr>
+        <w:t xml:space="preserve">. La clase </w:t>
+      </w:r>
+      <w:proofErr w:type="spellStart"/>
+      <w:r>
+        <w:rPr>
+          <w:rFonts w:asciiTheme="majorHAnsi" w:eastAsia="Arial" w:hAnsiTheme="majorHAnsi" w:cstheme="majorHAnsi"/>
+          <w:color w:val="2C2C2C"/>
+          <w:lang w:val="es-ES"/>
+        </w:rPr>
+        <w:t>AppDbContext</w:t>
+      </w:r>
+      <w:proofErr w:type="spellEnd"/>
+      <w:r>
+        <w:rPr>
+          <w:rFonts w:asciiTheme="majorHAnsi" w:eastAsia="Arial" w:hAnsiTheme="majorHAnsi" w:cstheme="majorHAnsi"/>
+          <w:color w:val="2C2C2C"/>
+          <w:lang w:val="es-ES"/>
+        </w:rPr>
+        <w:t xml:space="preserve"> centraliza el acceso a las tablas de la base de datos.</w:t>
       </w:r>
     </w:p>
     <w:p>
@@ -2845,7 +3179,43 @@
           <w:color w:val="2C2C2C"/>
           <w:lang w:val="es-ES"/>
         </w:rPr>
-        <w:t>Enfoque Code First: el esquema de base de datos se genera y versiona mediante migraciones EF.</w:t>
+        <w:t xml:space="preserve">Enfoque </w:t>
+      </w:r>
+      <w:proofErr w:type="spellStart"/>
+      <w:r>
+        <w:rPr>
+          <w:rFonts w:asciiTheme="majorHAnsi" w:eastAsia="Arial" w:hAnsiTheme="majorHAnsi" w:cstheme="majorHAnsi"/>
+          <w:color w:val="2C2C2C"/>
+          <w:lang w:val="es-ES"/>
+        </w:rPr>
+        <w:t>Code</w:t>
+      </w:r>
+      <w:proofErr w:type="spellEnd"/>
+      <w:r>
+        <w:rPr>
+          <w:rFonts w:asciiTheme="majorHAnsi" w:eastAsia="Arial" w:hAnsiTheme="majorHAnsi" w:cstheme="majorHAnsi"/>
+          <w:color w:val="2C2C2C"/>
+          <w:lang w:val="es-ES"/>
+        </w:rPr>
+        <w:t xml:space="preserve"> </w:t>
+      </w:r>
+      <w:proofErr w:type="spellStart"/>
+      <w:r>
+        <w:rPr>
+          <w:rFonts w:asciiTheme="majorHAnsi" w:eastAsia="Arial" w:hAnsiTheme="majorHAnsi" w:cstheme="majorHAnsi"/>
+          <w:color w:val="2C2C2C"/>
+          <w:lang w:val="es-ES"/>
+        </w:rPr>
+        <w:t>First</w:t>
+      </w:r>
+      <w:proofErr w:type="spellEnd"/>
+      <w:r>
+        <w:rPr>
+          <w:rFonts w:asciiTheme="majorHAnsi" w:eastAsia="Arial" w:hAnsiTheme="majorHAnsi" w:cstheme="majorHAnsi"/>
+          <w:color w:val="2C2C2C"/>
+          <w:lang w:val="es-ES"/>
+        </w:rPr>
+        <w:t>: el esquema de base de datos se genera y versiona mediante migraciones EF.</w:t>
       </w:r>
     </w:p>
     <w:p>
@@ -2863,13 +3233,41 @@
           <w:lang w:val="es-ES"/>
         </w:rPr>
       </w:pPr>
+      <w:proofErr w:type="spellStart"/>
       <w:r>
         <w:rPr>
           <w:rFonts w:asciiTheme="majorHAnsi" w:eastAsia="Arial" w:hAnsiTheme="majorHAnsi" w:cstheme="majorHAnsi"/>
           <w:color w:val="2C2C2C"/>
           <w:lang w:val="es-ES"/>
         </w:rPr>
-        <w:t>Fluent API: las relaciones y restricciones entre entidades se configuran en OnModelCreating, desacoplando las entidades de la lógica de base de datos.</w:t>
+        <w:t>Fluent</w:t>
+      </w:r>
+      <w:proofErr w:type="spellEnd"/>
+      <w:r>
+        <w:rPr>
+          <w:rFonts w:asciiTheme="majorHAnsi" w:eastAsia="Arial" w:hAnsiTheme="majorHAnsi" w:cstheme="majorHAnsi"/>
+          <w:color w:val="2C2C2C"/>
+          <w:lang w:val="es-ES"/>
+        </w:rPr>
+        <w:t xml:space="preserve"> API: las relaciones y restricciones entre entidades se configuran en </w:t>
+      </w:r>
+      <w:proofErr w:type="spellStart"/>
+      <w:r>
+        <w:rPr>
+          <w:rFonts w:asciiTheme="majorHAnsi" w:eastAsia="Arial" w:hAnsiTheme="majorHAnsi" w:cstheme="majorHAnsi"/>
+          <w:color w:val="2C2C2C"/>
+          <w:lang w:val="es-ES"/>
+        </w:rPr>
+        <w:t>OnModelCreating</w:t>
+      </w:r>
+      <w:proofErr w:type="spellEnd"/>
+      <w:r>
+        <w:rPr>
+          <w:rFonts w:asciiTheme="majorHAnsi" w:eastAsia="Arial" w:hAnsiTheme="majorHAnsi" w:cstheme="majorHAnsi"/>
+          <w:color w:val="2C2C2C"/>
+          <w:lang w:val="es-ES"/>
+        </w:rPr>
+        <w:t>, desacoplando las entidades de la lógica de base de datos.</w:t>
       </w:r>
     </w:p>
     <w:p>
@@ -2893,7 +3291,43 @@
           <w:color w:val="2C2C2C"/>
           <w:lang w:val="es-ES"/>
         </w:rPr>
-        <w:t>LINQ to Entities: todas las consultas se expresan en C# y EF las traduce a SQL optimizado.</w:t>
+        <w:t xml:space="preserve">LINQ </w:t>
+      </w:r>
+      <w:proofErr w:type="spellStart"/>
+      <w:r>
+        <w:rPr>
+          <w:rFonts w:asciiTheme="majorHAnsi" w:eastAsia="Arial" w:hAnsiTheme="majorHAnsi" w:cstheme="majorHAnsi"/>
+          <w:color w:val="2C2C2C"/>
+          <w:lang w:val="es-ES"/>
+        </w:rPr>
+        <w:t>to</w:t>
+      </w:r>
+      <w:proofErr w:type="spellEnd"/>
+      <w:r>
+        <w:rPr>
+          <w:rFonts w:asciiTheme="majorHAnsi" w:eastAsia="Arial" w:hAnsiTheme="majorHAnsi" w:cstheme="majorHAnsi"/>
+          <w:color w:val="2C2C2C"/>
+          <w:lang w:val="es-ES"/>
+        </w:rPr>
+        <w:t xml:space="preserve"> </w:t>
+      </w:r>
+      <w:proofErr w:type="spellStart"/>
+      <w:r>
+        <w:rPr>
+          <w:rFonts w:asciiTheme="majorHAnsi" w:eastAsia="Arial" w:hAnsiTheme="majorHAnsi" w:cstheme="majorHAnsi"/>
+          <w:color w:val="2C2C2C"/>
+          <w:lang w:val="es-ES"/>
+        </w:rPr>
+        <w:t>Entities</w:t>
+      </w:r>
+      <w:proofErr w:type="spellEnd"/>
+      <w:r>
+        <w:rPr>
+          <w:rFonts w:asciiTheme="majorHAnsi" w:eastAsia="Arial" w:hAnsiTheme="majorHAnsi" w:cstheme="majorHAnsi"/>
+          <w:color w:val="2C2C2C"/>
+          <w:lang w:val="es-ES"/>
+        </w:rPr>
+        <w:t>: todas las consultas se expresan en C# y EF las traduce a SQL optimizado.</w:t>
       </w:r>
     </w:p>
     <w:p>
@@ -2917,7 +3351,25 @@
           <w:color w:val="2C2C2C"/>
           <w:lang w:val="es-ES"/>
         </w:rPr>
-        <w:t>Conexión: SQL Server LocalDB/Express en instancia DESKTOP-95UPOKJ\SQLEXPRESS01.</w:t>
+        <w:t xml:space="preserve">Conexión: SQL Server </w:t>
+      </w:r>
+      <w:proofErr w:type="spellStart"/>
+      <w:r>
+        <w:rPr>
+          <w:rFonts w:asciiTheme="majorHAnsi" w:eastAsia="Arial" w:hAnsiTheme="majorHAnsi" w:cstheme="majorHAnsi"/>
+          <w:color w:val="2C2C2C"/>
+          <w:lang w:val="es-ES"/>
+        </w:rPr>
+        <w:t>LocalDB</w:t>
+      </w:r>
+      <w:proofErr w:type="spellEnd"/>
+      <w:r>
+        <w:rPr>
+          <w:rFonts w:asciiTheme="majorHAnsi" w:eastAsia="Arial" w:hAnsiTheme="majorHAnsi" w:cstheme="majorHAnsi"/>
+          <w:color w:val="2C2C2C"/>
+          <w:lang w:val="es-ES"/>
+        </w:rPr>
+        <w:t>/Express en instancia DESKTOP-95UPOKJ\SQLEXPRESS01.</w:t>
       </w:r>
     </w:p>
     <w:p>
@@ -2978,13 +3430,59 @@
           <w:lang w:val="es-ES"/>
         </w:rPr>
       </w:pPr>
+      <w:proofErr w:type="spellStart"/>
       <w:r>
         <w:rPr>
           <w:rFonts w:asciiTheme="majorHAnsi" w:eastAsia="Arial" w:hAnsiTheme="majorHAnsi" w:cstheme="majorHAnsi"/>
           <w:color w:val="2C2C2C"/>
           <w:lang w:val="es-ES"/>
         </w:rPr>
-        <w:t>MaterialSkin 2 es una librería de terceros que aplica el diseño Material Design de Google a los controles estándar de Windows Forms. Permite obtener una interfaz moderna y cohesionada sin partir de cero en el diseño visual.</w:t>
+        <w:t>MaterialSkin</w:t>
+      </w:r>
+      <w:proofErr w:type="spellEnd"/>
+      <w:r>
+        <w:rPr>
+          <w:rFonts w:asciiTheme="majorHAnsi" w:eastAsia="Arial" w:hAnsiTheme="majorHAnsi" w:cstheme="majorHAnsi"/>
+          <w:color w:val="2C2C2C"/>
+          <w:lang w:val="es-ES"/>
+        </w:rPr>
+        <w:t xml:space="preserve"> 2 es una librería de terceros que aplica el diseño Material </w:t>
+      </w:r>
+      <w:proofErr w:type="spellStart"/>
+      <w:r>
+        <w:rPr>
+          <w:rFonts w:asciiTheme="majorHAnsi" w:eastAsia="Arial" w:hAnsiTheme="majorHAnsi" w:cstheme="majorHAnsi"/>
+          <w:color w:val="2C2C2C"/>
+          <w:lang w:val="es-ES"/>
+        </w:rPr>
+        <w:t>Design</w:t>
+      </w:r>
+      <w:proofErr w:type="spellEnd"/>
+      <w:r>
+        <w:rPr>
+          <w:rFonts w:asciiTheme="majorHAnsi" w:eastAsia="Arial" w:hAnsiTheme="majorHAnsi" w:cstheme="majorHAnsi"/>
+          <w:color w:val="2C2C2C"/>
+          <w:lang w:val="es-ES"/>
+        </w:rPr>
+        <w:t xml:space="preserve"> de Google a los controles estándar de Windows </w:t>
+      </w:r>
+      <w:proofErr w:type="spellStart"/>
+      <w:r>
+        <w:rPr>
+          <w:rFonts w:asciiTheme="majorHAnsi" w:eastAsia="Arial" w:hAnsiTheme="majorHAnsi" w:cstheme="majorHAnsi"/>
+          <w:color w:val="2C2C2C"/>
+          <w:lang w:val="es-ES"/>
+        </w:rPr>
+        <w:t>Forms</w:t>
+      </w:r>
+      <w:proofErr w:type="spellEnd"/>
+      <w:r>
+        <w:rPr>
+          <w:rFonts w:asciiTheme="majorHAnsi" w:eastAsia="Arial" w:hAnsiTheme="majorHAnsi" w:cstheme="majorHAnsi"/>
+          <w:color w:val="2C2C2C"/>
+          <w:lang w:val="es-ES"/>
+        </w:rPr>
+        <w:t>. Permite obtener una interfaz moderna y cohesionada sin partir de cero en el diseño visual.</w:t>
       </w:r>
     </w:p>
     <w:p>
@@ -3032,7 +3530,43 @@
           <w:color w:val="2C2C2C"/>
           <w:lang w:val="es-ES"/>
         </w:rPr>
-        <w:t>Paleta de colores personalizada: fondo RGB(25,25,40), sidebar RGB(35,35,55), accent morado RGB(88,101,242).</w:t>
+        <w:t xml:space="preserve">Paleta de colores personalizada: fondo RGB(25,25,40), </w:t>
+      </w:r>
+      <w:proofErr w:type="spellStart"/>
+      <w:r>
+        <w:rPr>
+          <w:rFonts w:asciiTheme="majorHAnsi" w:eastAsia="Arial" w:hAnsiTheme="majorHAnsi" w:cstheme="majorHAnsi"/>
+          <w:color w:val="2C2C2C"/>
+          <w:lang w:val="es-ES"/>
+        </w:rPr>
+        <w:t>sidebar</w:t>
+      </w:r>
+      <w:proofErr w:type="spellEnd"/>
+      <w:r>
+        <w:rPr>
+          <w:rFonts w:asciiTheme="majorHAnsi" w:eastAsia="Arial" w:hAnsiTheme="majorHAnsi" w:cstheme="majorHAnsi"/>
+          <w:color w:val="2C2C2C"/>
+          <w:lang w:val="es-ES"/>
+        </w:rPr>
+        <w:t xml:space="preserve"> RGB(35,35,55), </w:t>
+      </w:r>
+      <w:proofErr w:type="spellStart"/>
+      <w:r>
+        <w:rPr>
+          <w:rFonts w:asciiTheme="majorHAnsi" w:eastAsia="Arial" w:hAnsiTheme="majorHAnsi" w:cstheme="majorHAnsi"/>
+          <w:color w:val="2C2C2C"/>
+          <w:lang w:val="es-ES"/>
+        </w:rPr>
+        <w:t>accent</w:t>
+      </w:r>
+      <w:proofErr w:type="spellEnd"/>
+      <w:r>
+        <w:rPr>
+          <w:rFonts w:asciiTheme="majorHAnsi" w:eastAsia="Arial" w:hAnsiTheme="majorHAnsi" w:cstheme="majorHAnsi"/>
+          <w:color w:val="2C2C2C"/>
+          <w:lang w:val="es-ES"/>
+        </w:rPr>
+        <w:t xml:space="preserve"> morado RGB(88,101,242).</w:t>
       </w:r>
     </w:p>
     <w:p>
@@ -3056,7 +3590,79 @@
           <w:color w:val="2C2C2C"/>
           <w:lang w:val="es-ES"/>
         </w:rPr>
-        <w:t>Controles MaterialButton, MaterialTextBox, MaterialCard y MaterialTabControl aplicados en todas las vistas.</w:t>
+        <w:t xml:space="preserve">Controles </w:t>
+      </w:r>
+      <w:proofErr w:type="spellStart"/>
+      <w:r>
+        <w:rPr>
+          <w:rFonts w:asciiTheme="majorHAnsi" w:eastAsia="Arial" w:hAnsiTheme="majorHAnsi" w:cstheme="majorHAnsi"/>
+          <w:color w:val="2C2C2C"/>
+          <w:lang w:val="es-ES"/>
+        </w:rPr>
+        <w:t>MaterialButton</w:t>
+      </w:r>
+      <w:proofErr w:type="spellEnd"/>
+      <w:r>
+        <w:rPr>
+          <w:rFonts w:asciiTheme="majorHAnsi" w:eastAsia="Arial" w:hAnsiTheme="majorHAnsi" w:cstheme="majorHAnsi"/>
+          <w:color w:val="2C2C2C"/>
+          <w:lang w:val="es-ES"/>
+        </w:rPr>
+        <w:t xml:space="preserve">, </w:t>
+      </w:r>
+      <w:proofErr w:type="spellStart"/>
+      <w:r>
+        <w:rPr>
+          <w:rFonts w:asciiTheme="majorHAnsi" w:eastAsia="Arial" w:hAnsiTheme="majorHAnsi" w:cstheme="majorHAnsi"/>
+          <w:color w:val="2C2C2C"/>
+          <w:lang w:val="es-ES"/>
+        </w:rPr>
+        <w:t>MaterialTextBox</w:t>
+      </w:r>
+      <w:proofErr w:type="spellEnd"/>
+      <w:r>
+        <w:rPr>
+          <w:rFonts w:asciiTheme="majorHAnsi" w:eastAsia="Arial" w:hAnsiTheme="majorHAnsi" w:cstheme="majorHAnsi"/>
+          <w:color w:val="2C2C2C"/>
+          <w:lang w:val="es-ES"/>
+        </w:rPr>
+        <w:t xml:space="preserve">, </w:t>
+      </w:r>
+      <w:proofErr w:type="spellStart"/>
+      <w:r>
+        <w:rPr>
+          <w:rFonts w:asciiTheme="majorHAnsi" w:eastAsia="Arial" w:hAnsiTheme="majorHAnsi" w:cstheme="majorHAnsi"/>
+          <w:color w:val="2C2C2C"/>
+          <w:lang w:val="es-ES"/>
+        </w:rPr>
+        <w:t>MaterialCard</w:t>
+      </w:r>
+      <w:proofErr w:type="spellEnd"/>
+      <w:r>
+        <w:rPr>
+          <w:rFonts w:asciiTheme="majorHAnsi" w:eastAsia="Arial" w:hAnsiTheme="majorHAnsi" w:cstheme="majorHAnsi"/>
+          <w:color w:val="2C2C2C"/>
+          <w:lang w:val="es-ES"/>
+        </w:rPr>
+        <w:t xml:space="preserve"> y </w:t>
+      </w:r>
+      <w:proofErr w:type="spellStart"/>
+      <w:r>
+        <w:rPr>
+          <w:rFonts w:asciiTheme="majorHAnsi" w:eastAsia="Arial" w:hAnsiTheme="majorHAnsi" w:cstheme="majorHAnsi"/>
+          <w:color w:val="2C2C2C"/>
+          <w:lang w:val="es-ES"/>
+        </w:rPr>
+        <w:t>MaterialTabControl</w:t>
+      </w:r>
+      <w:proofErr w:type="spellEnd"/>
+      <w:r>
+        <w:rPr>
+          <w:rFonts w:asciiTheme="majorHAnsi" w:eastAsia="Arial" w:hAnsiTheme="majorHAnsi" w:cstheme="majorHAnsi"/>
+          <w:color w:val="2C2C2C"/>
+          <w:lang w:val="es-ES"/>
+        </w:rPr>
+        <w:t xml:space="preserve"> aplicados en todas las vistas.</w:t>
       </w:r>
     </w:p>
     <w:p>
@@ -3132,12 +3738,21 @@
           <w:rFonts w:asciiTheme="majorHAnsi" w:hAnsiTheme="majorHAnsi" w:cstheme="majorHAnsi"/>
         </w:rPr>
       </w:pPr>
+      <w:proofErr w:type="spellStart"/>
       <w:r>
         <w:rPr>
           <w:rFonts w:asciiTheme="majorHAnsi" w:eastAsia="Arial" w:hAnsiTheme="majorHAnsi" w:cstheme="majorHAnsi"/>
           <w:color w:val="2C2C2C"/>
         </w:rPr>
-        <w:t>Instancia: DESKTOP-95UPOKJ\SQLEXPRESS01.</w:t>
+        <w:t>Instancia</w:t>
+      </w:r>
+      <w:proofErr w:type="spellEnd"/>
+      <w:r>
+        <w:rPr>
+          <w:rFonts w:asciiTheme="majorHAnsi" w:eastAsia="Arial" w:hAnsiTheme="majorHAnsi" w:cstheme="majorHAnsi"/>
+          <w:color w:val="2C2C2C"/>
+        </w:rPr>
+        <w:t>: DESKTOP-95UPOKJ\SQLEXPRESS01.</w:t>
       </w:r>
     </w:p>
     <w:p>
@@ -3178,12 +3793,37 @@
           <w:rFonts w:asciiTheme="majorHAnsi" w:hAnsiTheme="majorHAnsi" w:cstheme="majorHAnsi"/>
         </w:rPr>
       </w:pPr>
+      <w:proofErr w:type="spellStart"/>
       <w:r>
         <w:rPr>
           <w:rFonts w:asciiTheme="majorHAnsi" w:eastAsia="Arial" w:hAnsiTheme="majorHAnsi" w:cstheme="majorHAnsi"/>
           <w:color w:val="2C2C2C"/>
         </w:rPr>
-        <w:t>Gestión mediante SQL Server Management Studio (SSMS).</w:t>
+        <w:t>Gestión</w:t>
+      </w:r>
+      <w:proofErr w:type="spellEnd"/>
+      <w:r>
+        <w:rPr>
+          <w:rFonts w:asciiTheme="majorHAnsi" w:eastAsia="Arial" w:hAnsiTheme="majorHAnsi" w:cstheme="majorHAnsi"/>
+          <w:color w:val="2C2C2C"/>
+        </w:rPr>
+        <w:t xml:space="preserve"> </w:t>
+      </w:r>
+      <w:proofErr w:type="spellStart"/>
+      <w:r>
+        <w:rPr>
+          <w:rFonts w:asciiTheme="majorHAnsi" w:eastAsia="Arial" w:hAnsiTheme="majorHAnsi" w:cstheme="majorHAnsi"/>
+          <w:color w:val="2C2C2C"/>
+        </w:rPr>
+        <w:t>mediante</w:t>
+      </w:r>
+      <w:proofErr w:type="spellEnd"/>
+      <w:r>
+        <w:rPr>
+          <w:rFonts w:asciiTheme="majorHAnsi" w:eastAsia="Arial" w:hAnsiTheme="majorHAnsi" w:cstheme="majorHAnsi"/>
+          <w:color w:val="2C2C2C"/>
+        </w:rPr>
+        <w:t xml:space="preserve"> SQL Server Management Studio (SSMS).</w:t>
       </w:r>
     </w:p>
     <w:p>
@@ -3247,7 +3887,25 @@
           <w:szCs w:val="28"/>
           <w:lang w:val="es-ES"/>
         </w:rPr>
-        <w:t xml:space="preserve"> QuestPDF (para generar documentos PDF)</w:t>
+        <w:t xml:space="preserve"> </w:t>
+      </w:r>
+      <w:proofErr w:type="spellStart"/>
+      <w:r>
+        <w:rPr>
+          <w:sz w:val="28"/>
+          <w:szCs w:val="28"/>
+          <w:lang w:val="es-ES"/>
+        </w:rPr>
+        <w:t>QuestPDF</w:t>
+      </w:r>
+      <w:proofErr w:type="spellEnd"/>
+      <w:r>
+        <w:rPr>
+          <w:sz w:val="28"/>
+          <w:szCs w:val="28"/>
+          <w:lang w:val="es-ES"/>
+        </w:rPr>
+        <w:t xml:space="preserve"> (para generar documentos PDF)</w:t>
       </w:r>
     </w:p>
     <w:p>
@@ -3260,13 +3918,41 @@
           <w:lang w:val="es-ES"/>
         </w:rPr>
       </w:pPr>
+      <w:proofErr w:type="spellStart"/>
       <w:r>
         <w:rPr>
           <w:rFonts w:asciiTheme="majorHAnsi" w:eastAsia="Arial" w:hAnsiTheme="majorHAnsi" w:cstheme="majorHAnsi"/>
           <w:color w:val="2C2C2C"/>
           <w:lang w:val="es-ES"/>
         </w:rPr>
-        <w:t>QuestPDF es una librería moderna de generación de documentos PDF para .NET, basada en una API fluida y declarativa. Sustituye a alternativas más antiguas como iTextSharp y ofrece un diseño tipográfico de alta calidad.</w:t>
+        <w:t>QuestPDF</w:t>
+      </w:r>
+      <w:proofErr w:type="spellEnd"/>
+      <w:r>
+        <w:rPr>
+          <w:rFonts w:asciiTheme="majorHAnsi" w:eastAsia="Arial" w:hAnsiTheme="majorHAnsi" w:cstheme="majorHAnsi"/>
+          <w:color w:val="2C2C2C"/>
+          <w:lang w:val="es-ES"/>
+        </w:rPr>
+        <w:t xml:space="preserve"> es una librería moderna de generación de documentos PDF para .NET, basada en una API fluida y declarativa. Sustituye a alternativas más antiguas como </w:t>
+      </w:r>
+      <w:proofErr w:type="spellStart"/>
+      <w:r>
+        <w:rPr>
+          <w:rFonts w:asciiTheme="majorHAnsi" w:eastAsia="Arial" w:hAnsiTheme="majorHAnsi" w:cstheme="majorHAnsi"/>
+          <w:color w:val="2C2C2C"/>
+          <w:lang w:val="es-ES"/>
+        </w:rPr>
+        <w:t>iTextSharp</w:t>
+      </w:r>
+      <w:proofErr w:type="spellEnd"/>
+      <w:r>
+        <w:rPr>
+          <w:rFonts w:asciiTheme="majorHAnsi" w:eastAsia="Arial" w:hAnsiTheme="majorHAnsi" w:cstheme="majorHAnsi"/>
+          <w:color w:val="2C2C2C"/>
+          <w:lang w:val="es-ES"/>
+        </w:rPr>
+        <w:t xml:space="preserve"> y ofrece un diseño tipográfico de alta calidad.</w:t>
       </w:r>
     </w:p>
     <w:p>
@@ -3409,7 +4095,23 @@
         <w:t xml:space="preserve">La aplicación sigue una arquitectura en capas que separa las responsabilidades del sistema para facilitar el mantenimiento y la escalabilidad. </w:t>
       </w:r>
       <w:r>
-        <w:t>Las capas son las siguientes:</w:t>
+        <w:t xml:space="preserve">Las </w:t>
+      </w:r>
+      <w:proofErr w:type="spellStart"/>
+      <w:r>
+        <w:t>capas</w:t>
+      </w:r>
+      <w:proofErr w:type="spellEnd"/>
+      <w:r>
+        <w:t xml:space="preserve"> son las </w:t>
+      </w:r>
+      <w:proofErr w:type="spellStart"/>
+      <w:r>
+        <w:t>siguientes</w:t>
+      </w:r>
+      <w:proofErr w:type="spellEnd"/>
+      <w:r>
+        <w:t>:</w:t>
       </w:r>
     </w:p>
     <w:p>
@@ -3425,7 +4127,21 @@
         <w:rPr>
           <w:lang w:val="es-ES"/>
         </w:rPr>
-        <w:t>Capa de Modelos (models)</w:t>
+        <w:t>Capa de Modelos (</w:t>
+      </w:r>
+      <w:proofErr w:type="spellStart"/>
+      <w:r>
+        <w:rPr>
+          <w:lang w:val="es-ES"/>
+        </w:rPr>
+        <w:t>models</w:t>
+      </w:r>
+      <w:proofErr w:type="spellEnd"/>
+      <w:r>
+        <w:rPr>
+          <w:lang w:val="es-ES"/>
+        </w:rPr>
+        <w:t>)</w:t>
       </w:r>
       <w:bookmarkEnd w:id="5"/>
     </w:p>
@@ -3454,7 +4170,49 @@
         <w:rPr>
           <w:lang w:val="es-ES"/>
         </w:rPr>
-        <w:t>Cada clase está anotada con atributos de Entity Framework Core como [Key], [Required] y [MaxLength] que definen la estructura de la base de datos. Es la capa más independiente del sistema, ya que no tiene dependencias con ninguna otra capa</w:t>
+        <w:t xml:space="preserve">Cada clase está anotada con atributos de </w:t>
+      </w:r>
+      <w:proofErr w:type="spellStart"/>
+      <w:r>
+        <w:rPr>
+          <w:lang w:val="es-ES"/>
+        </w:rPr>
+        <w:t>Entity</w:t>
+      </w:r>
+      <w:proofErr w:type="spellEnd"/>
+      <w:r>
+        <w:rPr>
+          <w:lang w:val="es-ES"/>
+        </w:rPr>
+        <w:t xml:space="preserve"> Framework Core como [Key], [</w:t>
+      </w:r>
+      <w:proofErr w:type="spellStart"/>
+      <w:r>
+        <w:rPr>
+          <w:lang w:val="es-ES"/>
+        </w:rPr>
+        <w:t>Required</w:t>
+      </w:r>
+      <w:proofErr w:type="spellEnd"/>
+      <w:r>
+        <w:rPr>
+          <w:lang w:val="es-ES"/>
+        </w:rPr>
+        <w:t>] y [</w:t>
+      </w:r>
+      <w:proofErr w:type="spellStart"/>
+      <w:r>
+        <w:rPr>
+          <w:lang w:val="es-ES"/>
+        </w:rPr>
+        <w:t>MaxLength</w:t>
+      </w:r>
+      <w:proofErr w:type="spellEnd"/>
+      <w:r>
+        <w:rPr>
+          <w:lang w:val="es-ES"/>
+        </w:rPr>
+        <w:t>] que definen la estructura de la base de datos. Es la capa más independiente del sistema, ya que no tiene dependencias con ninguna otra capa</w:t>
       </w:r>
       <w:r>
         <w:rPr>
@@ -3491,7 +4249,63 @@
         <w:rPr>
           <w:lang w:val="es-ES"/>
         </w:rPr>
-        <w:t>Contiene la clase AppDbContext, que hereda de DbContext y actúa como puente entre la aplicación y SQL Server. Define los DbSet de cada entidad y configura la cadena de conexión. Al arrancar la aplicación, si la base de datos no existe, se crea automáticamente mediante el método EnsureCreated()</w:t>
+        <w:t xml:space="preserve">Contiene la clase </w:t>
+      </w:r>
+      <w:proofErr w:type="spellStart"/>
+      <w:r>
+        <w:rPr>
+          <w:lang w:val="es-ES"/>
+        </w:rPr>
+        <w:t>AppDbContext</w:t>
+      </w:r>
+      <w:proofErr w:type="spellEnd"/>
+      <w:r>
+        <w:rPr>
+          <w:lang w:val="es-ES"/>
+        </w:rPr>
+        <w:t xml:space="preserve">, que hereda de </w:t>
+      </w:r>
+      <w:proofErr w:type="spellStart"/>
+      <w:r>
+        <w:rPr>
+          <w:lang w:val="es-ES"/>
+        </w:rPr>
+        <w:t>DbContext</w:t>
+      </w:r>
+      <w:proofErr w:type="spellEnd"/>
+      <w:r>
+        <w:rPr>
+          <w:lang w:val="es-ES"/>
+        </w:rPr>
+        <w:t xml:space="preserve"> y actúa como puente entre la aplicación y SQL Server. Define los </w:t>
+      </w:r>
+      <w:proofErr w:type="spellStart"/>
+      <w:r>
+        <w:rPr>
+          <w:lang w:val="es-ES"/>
+        </w:rPr>
+        <w:t>DbSet</w:t>
+      </w:r>
+      <w:proofErr w:type="spellEnd"/>
+      <w:r>
+        <w:rPr>
+          <w:lang w:val="es-ES"/>
+        </w:rPr>
+        <w:t xml:space="preserve"> de cada entidad y configura la cadena de conexión. Al arrancar la aplicación, si la base de datos no existe, se crea automáticamente mediante el método </w:t>
+      </w:r>
+      <w:proofErr w:type="spellStart"/>
+      <w:r>
+        <w:rPr>
+          <w:lang w:val="es-ES"/>
+        </w:rPr>
+        <w:t>EnsureCreated</w:t>
+      </w:r>
+      <w:proofErr w:type="spellEnd"/>
+      <w:r>
+        <w:rPr>
+          <w:lang w:val="es-ES"/>
+        </w:rPr>
+        <w:t>()</w:t>
       </w:r>
       <w:r>
         <w:rPr>
@@ -3512,9 +4326,11 @@
       <w:r>
         <w:t xml:space="preserve">Capa de </w:t>
       </w:r>
+      <w:proofErr w:type="spellStart"/>
       <w:r>
         <w:t>Informes</w:t>
       </w:r>
+      <w:proofErr w:type="spellEnd"/>
       <w:r>
         <w:t xml:space="preserve"> (</w:t>
       </w:r>
@@ -3537,7 +4353,35 @@
         <w:rPr>
           <w:lang w:val="es-ES"/>
         </w:rPr>
-        <w:t>Contiene la clase NominaReport, responsable de la generación de documentos PDF mediante QuestPDF. Recibe los datos de la nómina, el empleado y la empresa, y genera un documento con todos los conceptos salariales desglosados de forma profesional</w:t>
+        <w:t xml:space="preserve">Contiene la clase </w:t>
+      </w:r>
+      <w:proofErr w:type="spellStart"/>
+      <w:r>
+        <w:rPr>
+          <w:lang w:val="es-ES"/>
+        </w:rPr>
+        <w:t>NominaReport</w:t>
+      </w:r>
+      <w:proofErr w:type="spellEnd"/>
+      <w:r>
+        <w:rPr>
+          <w:lang w:val="es-ES"/>
+        </w:rPr>
+        <w:t xml:space="preserve">, responsable de la generación de documentos PDF mediante </w:t>
+      </w:r>
+      <w:proofErr w:type="spellStart"/>
+      <w:r>
+        <w:rPr>
+          <w:lang w:val="es-ES"/>
+        </w:rPr>
+        <w:t>QuestPDF</w:t>
+      </w:r>
+      <w:proofErr w:type="spellEnd"/>
+      <w:r>
+        <w:rPr>
+          <w:lang w:val="es-ES"/>
+        </w:rPr>
+        <w:t>. Recibe los datos de la nómina, el empleado y la empresa, y genera un documento con todos los conceptos salariales desglosados de forma profesional</w:t>
       </w:r>
       <w:r>
         <w:rPr>
@@ -3571,7 +4415,77 @@
         <w:rPr>
           <w:lang w:val="es-ES"/>
         </w:rPr>
-        <w:t>Contiene los formularios Windows Forms y los UserControls que conforman la interfaz de usuario. Está dividida en dos subcarpetas: vistasAdmin, con los módulos accesibles para el administrador, y vistasEmpleado, con los módulos del empleado. Cada UserControl se carga dinámicamente en el panel central del formulario principal</w:t>
+        <w:t xml:space="preserve">Contiene los formularios Windows </w:t>
+      </w:r>
+      <w:proofErr w:type="spellStart"/>
+      <w:r>
+        <w:rPr>
+          <w:lang w:val="es-ES"/>
+        </w:rPr>
+        <w:t>Forms</w:t>
+      </w:r>
+      <w:proofErr w:type="spellEnd"/>
+      <w:r>
+        <w:rPr>
+          <w:lang w:val="es-ES"/>
+        </w:rPr>
+        <w:t xml:space="preserve"> y los </w:t>
+      </w:r>
+      <w:proofErr w:type="spellStart"/>
+      <w:r>
+        <w:rPr>
+          <w:lang w:val="es-ES"/>
+        </w:rPr>
+        <w:t>UserControls</w:t>
+      </w:r>
+      <w:proofErr w:type="spellEnd"/>
+      <w:r>
+        <w:rPr>
+          <w:lang w:val="es-ES"/>
+        </w:rPr>
+        <w:t xml:space="preserve"> que conforman la interfaz de usuario. Está dividida en dos subcarpetas: </w:t>
+      </w:r>
+      <w:proofErr w:type="spellStart"/>
+      <w:r>
+        <w:rPr>
+          <w:lang w:val="es-ES"/>
+        </w:rPr>
+        <w:t>vistasAdmin</w:t>
+      </w:r>
+      <w:proofErr w:type="spellEnd"/>
+      <w:r>
+        <w:rPr>
+          <w:lang w:val="es-ES"/>
+        </w:rPr>
+        <w:t xml:space="preserve">, con los módulos accesibles para el administrador, y </w:t>
+      </w:r>
+      <w:proofErr w:type="spellStart"/>
+      <w:r>
+        <w:rPr>
+          <w:lang w:val="es-ES"/>
+        </w:rPr>
+        <w:t>vistasEmpleado</w:t>
+      </w:r>
+      <w:proofErr w:type="spellEnd"/>
+      <w:r>
+        <w:rPr>
+          <w:lang w:val="es-ES"/>
+        </w:rPr>
+        <w:t xml:space="preserve">, con los módulos del empleado. Cada </w:t>
+      </w:r>
+      <w:proofErr w:type="spellStart"/>
+      <w:r>
+        <w:rPr>
+          <w:lang w:val="es-ES"/>
+        </w:rPr>
+        <w:t>UserControl</w:t>
+      </w:r>
+      <w:proofErr w:type="spellEnd"/>
+      <w:r>
+        <w:rPr>
+          <w:lang w:val="es-ES"/>
+        </w:rPr>
+        <w:t xml:space="preserve"> se carga dinámicamente en el panel central del formulario principal</w:t>
       </w:r>
       <w:r>
         <w:rPr>
@@ -3767,7 +4681,23 @@
         <w:ind w:left="1080"/>
       </w:pPr>
       <w:r>
-        <w:t>RF1.1 Registro de usuarios.</w:t>
+        <w:t xml:space="preserve">RF1.1 </w:t>
+      </w:r>
+      <w:proofErr w:type="spellStart"/>
+      <w:r>
+        <w:t>Registro</w:t>
+      </w:r>
+      <w:proofErr w:type="spellEnd"/>
+      <w:r>
+        <w:t xml:space="preserve"> de </w:t>
+      </w:r>
+      <w:proofErr w:type="spellStart"/>
+      <w:r>
+        <w:t>usuarios</w:t>
+      </w:r>
+      <w:proofErr w:type="spellEnd"/>
+      <w:r>
+        <w:t>.</w:t>
       </w:r>
     </w:p>
     <w:p>
@@ -3780,7 +4710,15 @@
         <w:ind w:left="1080"/>
       </w:pPr>
       <w:r>
-        <w:t>RF1.2 Autenticación.</w:t>
+        <w:t xml:space="preserve">RF1.2 </w:t>
+      </w:r>
+      <w:proofErr w:type="spellStart"/>
+      <w:r>
+        <w:t>Autenticación</w:t>
+      </w:r>
+      <w:proofErr w:type="spellEnd"/>
+      <w:r>
+        <w:t>.</w:t>
       </w:r>
     </w:p>
     <w:p>
@@ -3810,8 +4748,30 @@
         <w:rPr>
           <w:b/>
         </w:rPr>
-        <w:t>RF2. Gestión de empleados</w:t>
-      </w:r>
+        <w:t xml:space="preserve">RF2. </w:t>
+      </w:r>
+      <w:proofErr w:type="spellStart"/>
+      <w:r>
+        <w:rPr>
+          <w:b/>
+        </w:rPr>
+        <w:t>Gestión</w:t>
+      </w:r>
+      <w:proofErr w:type="spellEnd"/>
+      <w:r>
+        <w:rPr>
+          <w:b/>
+        </w:rPr>
+        <w:t xml:space="preserve"> de </w:t>
+      </w:r>
+      <w:proofErr w:type="spellStart"/>
+      <w:r>
+        <w:rPr>
+          <w:b/>
+        </w:rPr>
+        <w:t>empleados</w:t>
+      </w:r>
+      <w:proofErr w:type="spellEnd"/>
     </w:p>
     <w:p>
       <w:pPr>
@@ -3859,8 +4819,16 @@
         <w:rPr>
           <w:b/>
         </w:rPr>
-        <w:t>RF3. Control de asistencia</w:t>
-      </w:r>
+        <w:t xml:space="preserve">RF3. Control de </w:t>
+      </w:r>
+      <w:proofErr w:type="spellStart"/>
+      <w:r>
+        <w:rPr>
+          <w:b/>
+        </w:rPr>
+        <w:t>asistencia</w:t>
+      </w:r>
+      <w:proofErr w:type="spellEnd"/>
     </w:p>
     <w:p>
       <w:pPr>
@@ -3911,7 +4879,23 @@
       </w:pPr>
       <w:r>
         <w:lastRenderedPageBreak/>
-        <w:t>RF3.2.1 Horas por defecto.</w:t>
+        <w:t xml:space="preserve">RF3.2.1 Horas </w:t>
+      </w:r>
+      <w:proofErr w:type="spellStart"/>
+      <w:r>
+        <w:t>por</w:t>
+      </w:r>
+      <w:proofErr w:type="spellEnd"/>
+      <w:r>
+        <w:t xml:space="preserve"> </w:t>
+      </w:r>
+      <w:proofErr w:type="spellStart"/>
+      <w:r>
+        <w:t>defecto</w:t>
+      </w:r>
+      <w:proofErr w:type="spellEnd"/>
+      <w:r>
+        <w:t>.</w:t>
       </w:r>
     </w:p>
     <w:p>
@@ -3924,7 +4908,23 @@
         <w:ind w:left="1440"/>
       </w:pPr>
       <w:r>
-        <w:t>RF3.2.2 Horas por exceso.</w:t>
+        <w:t xml:space="preserve">RF3.2.2 Horas </w:t>
+      </w:r>
+      <w:proofErr w:type="spellStart"/>
+      <w:r>
+        <w:t>por</w:t>
+      </w:r>
+      <w:proofErr w:type="spellEnd"/>
+      <w:r>
+        <w:t xml:space="preserve"> </w:t>
+      </w:r>
+      <w:proofErr w:type="spellStart"/>
+      <w:r>
+        <w:t>exceso</w:t>
+      </w:r>
+      <w:proofErr w:type="spellEnd"/>
+      <w:r>
+        <w:t>.</w:t>
       </w:r>
     </w:p>
     <w:p>
@@ -3973,8 +4973,30 @@
         <w:rPr>
           <w:b/>
         </w:rPr>
-        <w:t>RF4. Gestión de horarios</w:t>
-      </w:r>
+        <w:t xml:space="preserve">RF4. </w:t>
+      </w:r>
+      <w:proofErr w:type="spellStart"/>
+      <w:r>
+        <w:rPr>
+          <w:b/>
+        </w:rPr>
+        <w:t>Gestión</w:t>
+      </w:r>
+      <w:proofErr w:type="spellEnd"/>
+      <w:r>
+        <w:rPr>
+          <w:b/>
+        </w:rPr>
+        <w:t xml:space="preserve"> de </w:t>
+      </w:r>
+      <w:proofErr w:type="spellStart"/>
+      <w:r>
+        <w:rPr>
+          <w:b/>
+        </w:rPr>
+        <w:t>horarios</w:t>
+      </w:r>
+      <w:proofErr w:type="spellEnd"/>
     </w:p>
     <w:p>
       <w:pPr>
@@ -4022,8 +5044,30 @@
         <w:rPr>
           <w:b/>
         </w:rPr>
-        <w:t>RF5. Gestión de nóminas</w:t>
-      </w:r>
+        <w:t xml:space="preserve">RF5. </w:t>
+      </w:r>
+      <w:proofErr w:type="spellStart"/>
+      <w:r>
+        <w:rPr>
+          <w:b/>
+        </w:rPr>
+        <w:t>Gestión</w:t>
+      </w:r>
+      <w:proofErr w:type="spellEnd"/>
+      <w:r>
+        <w:rPr>
+          <w:b/>
+        </w:rPr>
+        <w:t xml:space="preserve"> de </w:t>
+      </w:r>
+      <w:proofErr w:type="spellStart"/>
+      <w:r>
+        <w:rPr>
+          <w:b/>
+        </w:rPr>
+        <w:t>nóminas</w:t>
+      </w:r>
+      <w:proofErr w:type="spellEnd"/>
     </w:p>
     <w:p>
       <w:pPr>
@@ -4052,8 +5096,16 @@
         <w:rPr>
           <w:b/>
         </w:rPr>
-        <w:t>RF6. Informes</w:t>
-      </w:r>
+        <w:t xml:space="preserve">RF6. </w:t>
+      </w:r>
+      <w:proofErr w:type="spellStart"/>
+      <w:r>
+        <w:rPr>
+          <w:b/>
+        </w:rPr>
+        <w:t>Informes</w:t>
+      </w:r>
+      <w:proofErr w:type="spellEnd"/>
     </w:p>
     <w:p>
       <w:pPr>
@@ -4154,8 +5206,17 @@
           <w:b/>
           <w:bCs/>
         </w:rPr>
-        <w:t>RNF2. Arquitectura</w:t>
-      </w:r>
+        <w:t xml:space="preserve">RNF2. </w:t>
+      </w:r>
+      <w:proofErr w:type="spellStart"/>
+      <w:r>
+        <w:rPr>
+          <w:b/>
+          <w:bCs/>
+        </w:rPr>
+        <w:t>Arquitectura</w:t>
+      </w:r>
+      <w:proofErr w:type="spellEnd"/>
     </w:p>
     <w:p>
       <w:pPr>
@@ -4166,8 +5227,21 @@
         </w:tabs>
         <w:ind w:left="1800"/>
       </w:pPr>
-      <w:r>
-        <w:t>por definir.</w:t>
+      <w:proofErr w:type="spellStart"/>
+      <w:r>
+        <w:t>por</w:t>
+      </w:r>
+      <w:proofErr w:type="spellEnd"/>
+      <w:r>
+        <w:t xml:space="preserve"> </w:t>
+      </w:r>
+      <w:proofErr w:type="spellStart"/>
+      <w:r>
+        <w:t>definir</w:t>
+      </w:r>
+      <w:proofErr w:type="spellEnd"/>
+      <w:r>
+        <w:t>.</w:t>
       </w:r>
     </w:p>
     <w:p>
@@ -4299,10 +5373,10 @@
         </w:rPr>
         <w:lastRenderedPageBreak/>
         <w:drawing>
-          <wp:inline distT="0" distB="0" distL="0" distR="0" wp14:anchorId="28008B3B" wp14:editId="37EA2825">
-            <wp:extent cx="4019550" cy="2695575"/>
-            <wp:effectExtent l="0" t="0" r="0" b="9525"/>
-            <wp:docPr id="2" name="Imagen 2"/>
+          <wp:inline distT="0" distB="0" distL="0" distR="0" wp14:anchorId="7EF068F2" wp14:editId="547D20F5">
+            <wp:extent cx="5972810" cy="7305040"/>
+            <wp:effectExtent l="0" t="0" r="8890" b="0"/>
+            <wp:docPr id="674663514" name="Picture 2" descr="A diagram of a person's figure&#10;&#10;AI-generated content may be incorrect."/>
             <wp:cNvGraphicFramePr>
               <a:graphicFrameLocks xmlns:a="http://schemas.openxmlformats.org/drawingml/2006/main" noChangeAspect="1"/>
             </wp:cNvGraphicFramePr>
@@ -4310,39 +5384,23 @@
               <a:graphicData uri="http://schemas.openxmlformats.org/drawingml/2006/picture">
                 <pic:pic xmlns:pic="http://schemas.openxmlformats.org/drawingml/2006/picture">
                   <pic:nvPicPr>
-                    <pic:cNvPr id="0" name="Picture 1"/>
-                    <pic:cNvPicPr>
-                      <a:picLocks noChangeAspect="1" noChangeArrowheads="1"/>
-                    </pic:cNvPicPr>
+                    <pic:cNvPr id="674663514" name="Picture 2" descr="A diagram of a person's figure&#10;&#10;AI-generated content may be incorrect."/>
+                    <pic:cNvPicPr/>
                   </pic:nvPicPr>
-                  <pic:blipFill rotWithShape="1">
-                    <a:blip r:embed="rId8">
-                      <a:extLst>
-                        <a:ext uri="{28A0092B-C50C-407E-A947-70E740481C1C}">
-                          <a14:useLocalDpi xmlns:a14="http://schemas.microsoft.com/office/drawing/2010/main" val="0"/>
-                        </a:ext>
-                      </a:extLst>
-                    </a:blip>
-                    <a:srcRect l="3936" t="14610" r="20572" b="14106"/>
-                    <a:stretch/>
+                  <pic:blipFill>
+                    <a:blip r:embed="rId8"/>
+                    <a:stretch>
+                      <a:fillRect/>
+                    </a:stretch>
                   </pic:blipFill>
-                  <pic:spPr bwMode="auto">
+                  <pic:spPr>
                     <a:xfrm>
                       <a:off x="0" y="0"/>
-                      <a:ext cx="4019550" cy="2695575"/>
+                      <a:ext cx="5972810" cy="7305040"/>
                     </a:xfrm>
                     <a:prstGeom prst="rect">
                       <a:avLst/>
                     </a:prstGeom>
-                    <a:noFill/>
-                    <a:ln>
-                      <a:noFill/>
-                    </a:ln>
-                    <a:extLst>
-                      <a:ext uri="{53640926-AAD7-44D8-BBD7-CCE9431645EC}">
-                        <a14:shadowObscured xmlns:a14="http://schemas.microsoft.com/office/drawing/2010/main"/>
-                      </a:ext>
-                    </a:extLst>
                   </pic:spPr>
                 </pic:pic>
               </a:graphicData>
@@ -4366,7 +5424,21 @@
           <w:i/>
           <w:lang w:val="es-ES"/>
         </w:rPr>
-        <w:t>Figura 1. Diagrama de casos de uso.</w:t>
+        <w:t xml:space="preserve">Figura </w:t>
+      </w:r>
+      <w:r>
+        <w:rPr>
+          <w:i/>
+          <w:lang w:val="es-ES"/>
+        </w:rPr>
+        <w:t>2</w:t>
+      </w:r>
+      <w:r>
+        <w:rPr>
+          <w:i/>
+          <w:lang w:val="es-ES"/>
+        </w:rPr>
+        <w:t>. Diagrama de casos de uso.</w:t>
       </w:r>
     </w:p>
     <w:p>
@@ -4385,6 +5457,7 @@
         <w:rPr>
           <w:lang w:val="es-ES"/>
         </w:rPr>
+        <w:lastRenderedPageBreak/>
         <w:t>Fichas de Casos de Uso</w:t>
       </w:r>
       <w:bookmarkEnd w:id="14"/>
@@ -4466,8 +5539,18 @@
                 <w:sz w:val="20"/>
                 <w:szCs w:val="20"/>
               </w:rPr>
-              <w:t>RF1 — Login y autenticación</w:t>
-            </w:r>
+              <w:t xml:space="preserve">RF1 — Login y </w:t>
+            </w:r>
+            <w:proofErr w:type="spellStart"/>
+            <w:r>
+              <w:rPr>
+                <w:rFonts w:ascii="Arial" w:eastAsia="Arial" w:hAnsi="Arial" w:cs="Arial"/>
+                <w:sz w:val="20"/>
+                <w:szCs w:val="20"/>
+              </w:rPr>
+              <w:t>autenticación</w:t>
+            </w:r>
+            <w:proofErr w:type="spellEnd"/>
           </w:p>
         </w:tc>
       </w:tr>
@@ -4519,14 +5602,34 @@
             </w:tcMar>
           </w:tcPr>
           <w:p>
+            <w:proofErr w:type="spellStart"/>
             <w:r>
               <w:rPr>
                 <w:rFonts w:ascii="Arial" w:eastAsia="Arial" w:hAnsi="Arial" w:cs="Arial"/>
                 <w:sz w:val="20"/>
                 <w:szCs w:val="20"/>
               </w:rPr>
-              <w:t>Administrador / Empleado</w:t>
-            </w:r>
+              <w:t>Administrador</w:t>
+            </w:r>
+            <w:proofErr w:type="spellEnd"/>
+            <w:r>
+              <w:rPr>
+                <w:rFonts w:ascii="Arial" w:eastAsia="Arial" w:hAnsi="Arial" w:cs="Arial"/>
+                <w:sz w:val="20"/>
+                <w:szCs w:val="20"/>
+              </w:rPr>
+              <w:t xml:space="preserve"> / </w:t>
+            </w:r>
+            <w:proofErr w:type="spellStart"/>
+            <w:r>
+              <w:rPr>
+                <w:rFonts w:ascii="Arial" w:eastAsia="Arial" w:hAnsi="Arial" w:cs="Arial"/>
+                <w:sz w:val="20"/>
+                <w:szCs w:val="20"/>
+              </w:rPr>
+              <w:t>Empleado</w:t>
+            </w:r>
+            <w:proofErr w:type="spellEnd"/>
           </w:p>
         </w:tc>
       </w:tr>
@@ -4549,6 +5652,7 @@
             </w:tcMar>
           </w:tcPr>
           <w:p>
+            <w:proofErr w:type="spellStart"/>
             <w:r>
               <w:rPr>
                 <w:rFonts w:ascii="Arial" w:eastAsia="Arial" w:hAnsi="Arial" w:cs="Arial"/>
@@ -4559,6 +5663,7 @@
               </w:rPr>
               <w:t>Precondición</w:t>
             </w:r>
+            <w:proofErr w:type="spellEnd"/>
           </w:p>
         </w:tc>
         <w:tc>
@@ -4614,6 +5719,7 @@
             </w:tcMar>
           </w:tcPr>
           <w:p>
+            <w:proofErr w:type="spellStart"/>
             <w:r>
               <w:rPr>
                 <w:rFonts w:ascii="Arial" w:eastAsia="Arial" w:hAnsi="Arial" w:cs="Arial"/>
@@ -4624,6 +5730,7 @@
               </w:rPr>
               <w:t>Postcondición</w:t>
             </w:r>
+            <w:proofErr w:type="spellEnd"/>
           </w:p>
         </w:tc>
         <w:tc>
@@ -4655,7 +5762,47 @@
                 <w:szCs w:val="20"/>
                 <w:lang w:val="es-ES"/>
               </w:rPr>
-              <w:t>El usuario accede al formulario correspondiente a su rol (FormAdmin o FormEmpleado).</w:t>
+              <w:t>El usuario accede al formulario correspondiente a su rol (</w:t>
+            </w:r>
+            <w:proofErr w:type="spellStart"/>
+            <w:r>
+              <w:rPr>
+                <w:rFonts w:ascii="Arial" w:eastAsia="Arial" w:hAnsi="Arial" w:cs="Arial"/>
+                <w:sz w:val="20"/>
+                <w:szCs w:val="20"/>
+                <w:lang w:val="es-ES"/>
+              </w:rPr>
+              <w:t>FormAdmin</w:t>
+            </w:r>
+            <w:proofErr w:type="spellEnd"/>
+            <w:r>
+              <w:rPr>
+                <w:rFonts w:ascii="Arial" w:eastAsia="Arial" w:hAnsi="Arial" w:cs="Arial"/>
+                <w:sz w:val="20"/>
+                <w:szCs w:val="20"/>
+                <w:lang w:val="es-ES"/>
+              </w:rPr>
+              <w:t xml:space="preserve"> o </w:t>
+            </w:r>
+            <w:proofErr w:type="spellStart"/>
+            <w:r>
+              <w:rPr>
+                <w:rFonts w:ascii="Arial" w:eastAsia="Arial" w:hAnsi="Arial" w:cs="Arial"/>
+                <w:sz w:val="20"/>
+                <w:szCs w:val="20"/>
+                <w:lang w:val="es-ES"/>
+              </w:rPr>
+              <w:t>FormEmpleado</w:t>
+            </w:r>
+            <w:proofErr w:type="spellEnd"/>
+            <w:r>
+              <w:rPr>
+                <w:rFonts w:ascii="Arial" w:eastAsia="Arial" w:hAnsi="Arial" w:cs="Arial"/>
+                <w:sz w:val="20"/>
+                <w:szCs w:val="20"/>
+                <w:lang w:val="es-ES"/>
+              </w:rPr>
+              <w:t>).</w:t>
             </w:r>
           </w:p>
         </w:tc>
@@ -4679,6 +5826,7 @@
             </w:tcMar>
           </w:tcPr>
           <w:p>
+            <w:proofErr w:type="spellStart"/>
             <w:r>
               <w:rPr>
                 <w:rFonts w:ascii="Arial" w:eastAsia="Arial" w:hAnsi="Arial" w:cs="Arial"/>
@@ -4687,7 +5835,18 @@
                 <w:sz w:val="20"/>
                 <w:szCs w:val="20"/>
               </w:rPr>
-              <w:t>Flujo principal</w:t>
+              <w:t>Flujo</w:t>
+            </w:r>
+            <w:proofErr w:type="spellEnd"/>
+            <w:r>
+              <w:rPr>
+                <w:rFonts w:ascii="Arial" w:eastAsia="Arial" w:hAnsi="Arial" w:cs="Arial"/>
+                <w:b/>
+                <w:bCs/>
+                <w:sz w:val="20"/>
+                <w:szCs w:val="20"/>
+              </w:rPr>
+              <w:t xml:space="preserve"> principal</w:t>
             </w:r>
           </w:p>
         </w:tc>
@@ -4721,7 +5880,27 @@
                 <w:szCs w:val="20"/>
                 <w:lang w:val="es-ES"/>
               </w:rPr>
-              <w:t>1. El usuario introduce su correo electrónico y contraseña en el formulario de login.</w:t>
+              <w:t xml:space="preserve">1. El usuario introduce su correo electrónico y contraseña en el formulario de </w:t>
+            </w:r>
+            <w:proofErr w:type="spellStart"/>
+            <w:r>
+              <w:rPr>
+                <w:rFonts w:ascii="Arial" w:eastAsia="Arial" w:hAnsi="Arial" w:cs="Arial"/>
+                <w:sz w:val="20"/>
+                <w:szCs w:val="20"/>
+                <w:lang w:val="es-ES"/>
+              </w:rPr>
+              <w:t>login</w:t>
+            </w:r>
+            <w:proofErr w:type="spellEnd"/>
+            <w:r>
+              <w:rPr>
+                <w:rFonts w:ascii="Arial" w:eastAsia="Arial" w:hAnsi="Arial" w:cs="Arial"/>
+                <w:sz w:val="20"/>
+                <w:szCs w:val="20"/>
+                <w:lang w:val="es-ES"/>
+              </w:rPr>
+              <w:t>.</w:t>
             </w:r>
           </w:p>
           <w:p>
@@ -4982,6 +6161,7 @@
             </w:tcMar>
           </w:tcPr>
           <w:p>
+            <w:proofErr w:type="spellStart"/>
             <w:r>
               <w:rPr>
                 <w:rFonts w:ascii="Arial" w:eastAsia="Arial" w:hAnsi="Arial" w:cs="Arial"/>
@@ -4990,6 +6170,7 @@
               </w:rPr>
               <w:t>Administrador</w:t>
             </w:r>
+            <w:proofErr w:type="spellEnd"/>
           </w:p>
         </w:tc>
       </w:tr>
@@ -5012,6 +6193,7 @@
             </w:tcMar>
           </w:tcPr>
           <w:p>
+            <w:proofErr w:type="spellStart"/>
             <w:r>
               <w:rPr>
                 <w:rFonts w:ascii="Arial" w:eastAsia="Arial" w:hAnsi="Arial" w:cs="Arial"/>
@@ -5020,9 +6202,9 @@
                 <w:sz w:val="20"/>
                 <w:szCs w:val="20"/>
               </w:rPr>
-              <w:lastRenderedPageBreak/>
               <w:t>Precondición</w:t>
             </w:r>
+            <w:proofErr w:type="spellEnd"/>
           </w:p>
         </w:tc>
         <w:tc>
@@ -5078,6 +6260,7 @@
             </w:tcMar>
           </w:tcPr>
           <w:p>
+            <w:proofErr w:type="spellStart"/>
             <w:r>
               <w:rPr>
                 <w:rFonts w:ascii="Arial" w:eastAsia="Arial" w:hAnsi="Arial" w:cs="Arial"/>
@@ -5088,6 +6271,7 @@
               </w:rPr>
               <w:t>Postcondición</w:t>
             </w:r>
+            <w:proofErr w:type="spellEnd"/>
           </w:p>
         </w:tc>
         <w:tc>
@@ -5143,6 +6327,7 @@
             </w:tcMar>
           </w:tcPr>
           <w:p>
+            <w:proofErr w:type="spellStart"/>
             <w:r>
               <w:rPr>
                 <w:rFonts w:ascii="Arial" w:eastAsia="Arial" w:hAnsi="Arial" w:cs="Arial"/>
@@ -5151,7 +6336,18 @@
                 <w:sz w:val="20"/>
                 <w:szCs w:val="20"/>
               </w:rPr>
-              <w:t>Flujo principal</w:t>
+              <w:t>Flujo</w:t>
+            </w:r>
+            <w:proofErr w:type="spellEnd"/>
+            <w:r>
+              <w:rPr>
+                <w:rFonts w:ascii="Arial" w:eastAsia="Arial" w:hAnsi="Arial" w:cs="Arial"/>
+                <w:b/>
+                <w:bCs/>
+                <w:sz w:val="20"/>
+                <w:szCs w:val="20"/>
+              </w:rPr>
+              <w:t xml:space="preserve"> principal</w:t>
             </w:r>
           </w:p>
         </w:tc>
@@ -5185,7 +6381,47 @@
                 <w:szCs w:val="20"/>
                 <w:lang w:val="es-ES"/>
               </w:rPr>
-              <w:t>1. El administrador accede al UserControl de Empleados desde el sidebar.</w:t>
+              <w:t xml:space="preserve">1. El administrador accede al </w:t>
+            </w:r>
+            <w:proofErr w:type="spellStart"/>
+            <w:r>
+              <w:rPr>
+                <w:rFonts w:ascii="Arial" w:eastAsia="Arial" w:hAnsi="Arial" w:cs="Arial"/>
+                <w:sz w:val="20"/>
+                <w:szCs w:val="20"/>
+                <w:lang w:val="es-ES"/>
+              </w:rPr>
+              <w:t>UserControl</w:t>
+            </w:r>
+            <w:proofErr w:type="spellEnd"/>
+            <w:r>
+              <w:rPr>
+                <w:rFonts w:ascii="Arial" w:eastAsia="Arial" w:hAnsi="Arial" w:cs="Arial"/>
+                <w:sz w:val="20"/>
+                <w:szCs w:val="20"/>
+                <w:lang w:val="es-ES"/>
+              </w:rPr>
+              <w:t xml:space="preserve"> de Empleados desde el </w:t>
+            </w:r>
+            <w:proofErr w:type="spellStart"/>
+            <w:r>
+              <w:rPr>
+                <w:rFonts w:ascii="Arial" w:eastAsia="Arial" w:hAnsi="Arial" w:cs="Arial"/>
+                <w:sz w:val="20"/>
+                <w:szCs w:val="20"/>
+                <w:lang w:val="es-ES"/>
+              </w:rPr>
+              <w:t>sidebar</w:t>
+            </w:r>
+            <w:proofErr w:type="spellEnd"/>
+            <w:r>
+              <w:rPr>
+                <w:rFonts w:ascii="Arial" w:eastAsia="Arial" w:hAnsi="Arial" w:cs="Arial"/>
+                <w:sz w:val="20"/>
+                <w:szCs w:val="20"/>
+                <w:lang w:val="es-ES"/>
+              </w:rPr>
+              <w:t>.</w:t>
             </w:r>
           </w:p>
           <w:p>
@@ -5219,7 +6455,27 @@
                 <w:szCs w:val="20"/>
                 <w:lang w:val="es-ES"/>
               </w:rPr>
-              <w:t>3. El sistema valida los datos y los persiste mediante Entity Framework Core.</w:t>
+              <w:t xml:space="preserve">3. El sistema valida los datos y los persiste mediante </w:t>
+            </w:r>
+            <w:proofErr w:type="spellStart"/>
+            <w:r>
+              <w:rPr>
+                <w:rFonts w:ascii="Arial" w:eastAsia="Arial" w:hAnsi="Arial" w:cs="Arial"/>
+                <w:sz w:val="20"/>
+                <w:szCs w:val="20"/>
+                <w:lang w:val="es-ES"/>
+              </w:rPr>
+              <w:t>Entity</w:t>
+            </w:r>
+            <w:proofErr w:type="spellEnd"/>
+            <w:r>
+              <w:rPr>
+                <w:rFonts w:ascii="Arial" w:eastAsia="Arial" w:hAnsi="Arial" w:cs="Arial"/>
+                <w:sz w:val="20"/>
+                <w:szCs w:val="20"/>
+                <w:lang w:val="es-ES"/>
+              </w:rPr>
+              <w:t xml:space="preserve"> Framework Core.</w:t>
             </w:r>
           </w:p>
           <w:p>
@@ -5386,6 +6642,7 @@
             </w:tcMar>
           </w:tcPr>
           <w:p>
+            <w:proofErr w:type="spellStart"/>
             <w:r>
               <w:rPr>
                 <w:rFonts w:ascii="Arial" w:eastAsia="Arial" w:hAnsi="Arial" w:cs="Arial"/>
@@ -5394,6 +6651,7 @@
               </w:rPr>
               <w:t>Empleado</w:t>
             </w:r>
+            <w:proofErr w:type="spellEnd"/>
           </w:p>
         </w:tc>
       </w:tr>
@@ -5416,6 +6674,7 @@
             </w:tcMar>
           </w:tcPr>
           <w:p>
+            <w:proofErr w:type="spellStart"/>
             <w:r>
               <w:rPr>
                 <w:rFonts w:ascii="Arial" w:eastAsia="Arial" w:hAnsi="Arial" w:cs="Arial"/>
@@ -5426,6 +6685,7 @@
               </w:rPr>
               <w:t>Precondición</w:t>
             </w:r>
+            <w:proofErr w:type="spellEnd"/>
           </w:p>
         </w:tc>
         <w:tc>
@@ -5457,7 +6717,27 @@
                 <w:szCs w:val="20"/>
                 <w:lang w:val="es-ES"/>
               </w:rPr>
-              <w:t>El empleado ha iniciado sesión en su panel (FormEmpleado).</w:t>
+              <w:t>El empleado ha iniciado sesión en su panel (</w:t>
+            </w:r>
+            <w:proofErr w:type="spellStart"/>
+            <w:r>
+              <w:rPr>
+                <w:rFonts w:ascii="Arial" w:eastAsia="Arial" w:hAnsi="Arial" w:cs="Arial"/>
+                <w:sz w:val="20"/>
+                <w:szCs w:val="20"/>
+                <w:lang w:val="es-ES"/>
+              </w:rPr>
+              <w:t>FormEmpleado</w:t>
+            </w:r>
+            <w:proofErr w:type="spellEnd"/>
+            <w:r>
+              <w:rPr>
+                <w:rFonts w:ascii="Arial" w:eastAsia="Arial" w:hAnsi="Arial" w:cs="Arial"/>
+                <w:sz w:val="20"/>
+                <w:szCs w:val="20"/>
+                <w:lang w:val="es-ES"/>
+              </w:rPr>
+              <w:t>).</w:t>
             </w:r>
           </w:p>
         </w:tc>
@@ -5481,6 +6761,7 @@
             </w:tcMar>
           </w:tcPr>
           <w:p>
+            <w:proofErr w:type="spellStart"/>
             <w:r>
               <w:rPr>
                 <w:rFonts w:ascii="Arial" w:eastAsia="Arial" w:hAnsi="Arial" w:cs="Arial"/>
@@ -5489,8 +6770,10 @@
                 <w:sz w:val="20"/>
                 <w:szCs w:val="20"/>
               </w:rPr>
+              <w:lastRenderedPageBreak/>
               <w:t>Postcondición</w:t>
             </w:r>
+            <w:proofErr w:type="spellEnd"/>
           </w:p>
         </w:tc>
         <w:tc>
@@ -5546,6 +6829,7 @@
             </w:tcMar>
           </w:tcPr>
           <w:p>
+            <w:proofErr w:type="spellStart"/>
             <w:r>
               <w:rPr>
                 <w:rFonts w:ascii="Arial" w:eastAsia="Arial" w:hAnsi="Arial" w:cs="Arial"/>
@@ -5554,7 +6838,18 @@
                 <w:sz w:val="20"/>
                 <w:szCs w:val="20"/>
               </w:rPr>
-              <w:t>Flujo principal</w:t>
+              <w:t>Flujo</w:t>
+            </w:r>
+            <w:proofErr w:type="spellEnd"/>
+            <w:r>
+              <w:rPr>
+                <w:rFonts w:ascii="Arial" w:eastAsia="Arial" w:hAnsi="Arial" w:cs="Arial"/>
+                <w:b/>
+                <w:bCs/>
+                <w:sz w:val="20"/>
+                <w:szCs w:val="20"/>
+              </w:rPr>
+              <w:t xml:space="preserve"> principal</w:t>
             </w:r>
           </w:p>
         </w:tc>
@@ -5588,7 +6883,27 @@
                 <w:szCs w:val="20"/>
                 <w:lang w:val="es-ES"/>
               </w:rPr>
-              <w:t>1. El empleado accede al módulo de Fichar desde el sidebar.</w:t>
+              <w:t xml:space="preserve">1. El empleado accede al módulo de Fichar desde el </w:t>
+            </w:r>
+            <w:proofErr w:type="spellStart"/>
+            <w:r>
+              <w:rPr>
+                <w:rFonts w:ascii="Arial" w:eastAsia="Arial" w:hAnsi="Arial" w:cs="Arial"/>
+                <w:sz w:val="20"/>
+                <w:szCs w:val="20"/>
+                <w:lang w:val="es-ES"/>
+              </w:rPr>
+              <w:t>sidebar</w:t>
+            </w:r>
+            <w:proofErr w:type="spellEnd"/>
+            <w:r>
+              <w:rPr>
+                <w:rFonts w:ascii="Arial" w:eastAsia="Arial" w:hAnsi="Arial" w:cs="Arial"/>
+                <w:sz w:val="20"/>
+                <w:szCs w:val="20"/>
+                <w:lang w:val="es-ES"/>
+              </w:rPr>
+              <w:t>.</w:t>
             </w:r>
           </w:p>
           <w:p>
@@ -5639,7 +6954,27 @@
                 <w:szCs w:val="20"/>
                 <w:lang w:val="es-ES"/>
               </w:rPr>
-              <w:t>4. El sistema registra el fichaje con timestamp y actualiza el historial del día.</w:t>
+              <w:t xml:space="preserve">4. El sistema registra el fichaje con </w:t>
+            </w:r>
+            <w:proofErr w:type="spellStart"/>
+            <w:r>
+              <w:rPr>
+                <w:rFonts w:ascii="Arial" w:eastAsia="Arial" w:hAnsi="Arial" w:cs="Arial"/>
+                <w:sz w:val="20"/>
+                <w:szCs w:val="20"/>
+                <w:lang w:val="es-ES"/>
+              </w:rPr>
+              <w:t>timestamp</w:t>
+            </w:r>
+            <w:proofErr w:type="spellEnd"/>
+            <w:r>
+              <w:rPr>
+                <w:rFonts w:ascii="Arial" w:eastAsia="Arial" w:hAnsi="Arial" w:cs="Arial"/>
+                <w:sz w:val="20"/>
+                <w:szCs w:val="20"/>
+                <w:lang w:val="es-ES"/>
+              </w:rPr>
+              <w:t xml:space="preserve"> y actualiza el historial del día.</w:t>
             </w:r>
           </w:p>
         </w:tc>
@@ -5790,8 +7125,18 @@
                 <w:sz w:val="20"/>
                 <w:szCs w:val="20"/>
               </w:rPr>
-              <w:t>RF5 — Generación de nómina</w:t>
-            </w:r>
+              <w:t xml:space="preserve">RF5 — Generación de </w:t>
+            </w:r>
+            <w:proofErr w:type="spellStart"/>
+            <w:r>
+              <w:rPr>
+                <w:rFonts w:ascii="Arial" w:eastAsia="Arial" w:hAnsi="Arial" w:cs="Arial"/>
+                <w:sz w:val="20"/>
+                <w:szCs w:val="20"/>
+              </w:rPr>
+              <w:t>nómina</w:t>
+            </w:r>
+            <w:proofErr w:type="spellEnd"/>
           </w:p>
         </w:tc>
       </w:tr>
@@ -5843,6 +7188,7 @@
             </w:tcMar>
           </w:tcPr>
           <w:p>
+            <w:proofErr w:type="spellStart"/>
             <w:r>
               <w:rPr>
                 <w:rFonts w:ascii="Arial" w:eastAsia="Arial" w:hAnsi="Arial" w:cs="Arial"/>
@@ -5851,6 +7197,7 @@
               </w:rPr>
               <w:t>Administrador</w:t>
             </w:r>
+            <w:proofErr w:type="spellEnd"/>
           </w:p>
         </w:tc>
       </w:tr>
@@ -5873,6 +7220,7 @@
             </w:tcMar>
           </w:tcPr>
           <w:p>
+            <w:proofErr w:type="spellStart"/>
             <w:r>
               <w:rPr>
                 <w:rFonts w:ascii="Arial" w:eastAsia="Arial" w:hAnsi="Arial" w:cs="Arial"/>
@@ -5883,6 +7231,7 @@
               </w:rPr>
               <w:t>Precondición</w:t>
             </w:r>
+            <w:proofErr w:type="spellEnd"/>
           </w:p>
         </w:tc>
         <w:tc>
@@ -5938,6 +7287,7 @@
             </w:tcMar>
           </w:tcPr>
           <w:p>
+            <w:proofErr w:type="spellStart"/>
             <w:r>
               <w:rPr>
                 <w:rFonts w:ascii="Arial" w:eastAsia="Arial" w:hAnsi="Arial" w:cs="Arial"/>
@@ -5948,6 +7298,7 @@
               </w:rPr>
               <w:t>Postcondición</w:t>
             </w:r>
+            <w:proofErr w:type="spellEnd"/>
           </w:p>
         </w:tc>
         <w:tc>
@@ -6003,6 +7354,7 @@
             </w:tcMar>
           </w:tcPr>
           <w:p>
+            <w:proofErr w:type="spellStart"/>
             <w:r>
               <w:rPr>
                 <w:rFonts w:ascii="Arial" w:eastAsia="Arial" w:hAnsi="Arial" w:cs="Arial"/>
@@ -6011,7 +7363,18 @@
                 <w:sz w:val="20"/>
                 <w:szCs w:val="20"/>
               </w:rPr>
-              <w:t>Flujo principal</w:t>
+              <w:t>Flujo</w:t>
+            </w:r>
+            <w:proofErr w:type="spellEnd"/>
+            <w:r>
+              <w:rPr>
+                <w:rFonts w:ascii="Arial" w:eastAsia="Arial" w:hAnsi="Arial" w:cs="Arial"/>
+                <w:b/>
+                <w:bCs/>
+                <w:sz w:val="20"/>
+                <w:szCs w:val="20"/>
+              </w:rPr>
+              <w:t xml:space="preserve"> principal</w:t>
             </w:r>
           </w:p>
         </w:tc>
@@ -6096,7 +7459,6 @@
                 <w:szCs w:val="20"/>
                 <w:lang w:val="es-ES"/>
               </w:rPr>
-              <w:lastRenderedPageBreak/>
               <w:t>4. El administrador revisa el resultado y confirma la generación.</w:t>
             </w:r>
           </w:p>
@@ -6114,7 +7476,27 @@
                 <w:szCs w:val="20"/>
                 <w:lang w:val="es-ES"/>
               </w:rPr>
-              <w:t>5. El sistema genera el PDF con QuestPDF y lo guarda.</w:t>
+              <w:t xml:space="preserve">5. El sistema genera el PDF con </w:t>
+            </w:r>
+            <w:proofErr w:type="spellStart"/>
+            <w:r>
+              <w:rPr>
+                <w:rFonts w:ascii="Arial" w:eastAsia="Arial" w:hAnsi="Arial" w:cs="Arial"/>
+                <w:sz w:val="20"/>
+                <w:szCs w:val="20"/>
+                <w:lang w:val="es-ES"/>
+              </w:rPr>
+              <w:t>QuestPDF</w:t>
+            </w:r>
+            <w:proofErr w:type="spellEnd"/>
+            <w:r>
+              <w:rPr>
+                <w:rFonts w:ascii="Arial" w:eastAsia="Arial" w:hAnsi="Arial" w:cs="Arial"/>
+                <w:sz w:val="20"/>
+                <w:szCs w:val="20"/>
+                <w:lang w:val="es-ES"/>
+              </w:rPr>
+              <w:t xml:space="preserve"> y lo guarda.</w:t>
             </w:r>
           </w:p>
         </w:tc>
@@ -6205,8 +7587,36 @@
                 <w:sz w:val="20"/>
                 <w:szCs w:val="20"/>
               </w:rPr>
-              <w:t>RF6 — Gestión de vacaciones</w:t>
-            </w:r>
+              <w:t xml:space="preserve">RF6 — </w:t>
+            </w:r>
+            <w:proofErr w:type="spellStart"/>
+            <w:r>
+              <w:rPr>
+                <w:rFonts w:ascii="Arial" w:eastAsia="Arial" w:hAnsi="Arial" w:cs="Arial"/>
+                <w:sz w:val="20"/>
+                <w:szCs w:val="20"/>
+              </w:rPr>
+              <w:t>Gestión</w:t>
+            </w:r>
+            <w:proofErr w:type="spellEnd"/>
+            <w:r>
+              <w:rPr>
+                <w:rFonts w:ascii="Arial" w:eastAsia="Arial" w:hAnsi="Arial" w:cs="Arial"/>
+                <w:sz w:val="20"/>
+                <w:szCs w:val="20"/>
+              </w:rPr>
+              <w:t xml:space="preserve"> de </w:t>
+            </w:r>
+            <w:proofErr w:type="spellStart"/>
+            <w:r>
+              <w:rPr>
+                <w:rFonts w:ascii="Arial" w:eastAsia="Arial" w:hAnsi="Arial" w:cs="Arial"/>
+                <w:sz w:val="20"/>
+                <w:szCs w:val="20"/>
+              </w:rPr>
+              <w:t>vacaciones</w:t>
+            </w:r>
+            <w:proofErr w:type="spellEnd"/>
           </w:p>
         </w:tc>
       </w:tr>
@@ -6258,14 +7668,34 @@
             </w:tcMar>
           </w:tcPr>
           <w:p>
+            <w:proofErr w:type="spellStart"/>
             <w:r>
               <w:rPr>
                 <w:rFonts w:ascii="Arial" w:eastAsia="Arial" w:hAnsi="Arial" w:cs="Arial"/>
                 <w:sz w:val="20"/>
                 <w:szCs w:val="20"/>
               </w:rPr>
-              <w:t>Empleado / Administrador</w:t>
-            </w:r>
+              <w:t>Empleado</w:t>
+            </w:r>
+            <w:proofErr w:type="spellEnd"/>
+            <w:r>
+              <w:rPr>
+                <w:rFonts w:ascii="Arial" w:eastAsia="Arial" w:hAnsi="Arial" w:cs="Arial"/>
+                <w:sz w:val="20"/>
+                <w:szCs w:val="20"/>
+              </w:rPr>
+              <w:t xml:space="preserve"> / </w:t>
+            </w:r>
+            <w:proofErr w:type="spellStart"/>
+            <w:r>
+              <w:rPr>
+                <w:rFonts w:ascii="Arial" w:eastAsia="Arial" w:hAnsi="Arial" w:cs="Arial"/>
+                <w:sz w:val="20"/>
+                <w:szCs w:val="20"/>
+              </w:rPr>
+              <w:t>Administrador</w:t>
+            </w:r>
+            <w:proofErr w:type="spellEnd"/>
           </w:p>
         </w:tc>
       </w:tr>
@@ -6288,6 +7718,7 @@
             </w:tcMar>
           </w:tcPr>
           <w:p>
+            <w:proofErr w:type="spellStart"/>
             <w:r>
               <w:rPr>
                 <w:rFonts w:ascii="Arial" w:eastAsia="Arial" w:hAnsi="Arial" w:cs="Arial"/>
@@ -6298,6 +7729,7 @@
               </w:rPr>
               <w:t>Precondición</w:t>
             </w:r>
+            <w:proofErr w:type="spellEnd"/>
           </w:p>
         </w:tc>
         <w:tc>
@@ -6353,6 +7785,7 @@
             </w:tcMar>
           </w:tcPr>
           <w:p>
+            <w:proofErr w:type="spellStart"/>
             <w:r>
               <w:rPr>
                 <w:rFonts w:ascii="Arial" w:eastAsia="Arial" w:hAnsi="Arial" w:cs="Arial"/>
@@ -6363,6 +7796,7 @@
               </w:rPr>
               <w:t>Postcondición</w:t>
             </w:r>
+            <w:proofErr w:type="spellEnd"/>
           </w:p>
         </w:tc>
         <w:tc>
@@ -6418,6 +7852,7 @@
             </w:tcMar>
           </w:tcPr>
           <w:p>
+            <w:proofErr w:type="spellStart"/>
             <w:r>
               <w:rPr>
                 <w:rFonts w:ascii="Arial" w:eastAsia="Arial" w:hAnsi="Arial" w:cs="Arial"/>
@@ -6426,7 +7861,18 @@
                 <w:sz w:val="20"/>
                 <w:szCs w:val="20"/>
               </w:rPr>
-              <w:t>Flujo principal</w:t>
+              <w:t>Flujo</w:t>
+            </w:r>
+            <w:proofErr w:type="spellEnd"/>
+            <w:r>
+              <w:rPr>
+                <w:rFonts w:ascii="Arial" w:eastAsia="Arial" w:hAnsi="Arial" w:cs="Arial"/>
+                <w:b/>
+                <w:bCs/>
+                <w:sz w:val="20"/>
+                <w:szCs w:val="20"/>
+              </w:rPr>
+              <w:t xml:space="preserve"> principal</w:t>
             </w:r>
           </w:p>
         </w:tc>
@@ -6528,7 +7974,17 @@
                 <w:szCs w:val="20"/>
                 <w:lang w:val="es-ES"/>
               </w:rPr>
-              <w:t>5. El sistema notifica el cambio de estado y actualiza los días restantes si fue aprobada.</w:t>
+              <w:t xml:space="preserve">5. El sistema notifica el cambio de estado y actualiza los días restantes si fue </w:t>
+            </w:r>
+            <w:r>
+              <w:rPr>
+                <w:rFonts w:ascii="Arial" w:eastAsia="Arial" w:hAnsi="Arial" w:cs="Arial"/>
+                <w:sz w:val="20"/>
+                <w:szCs w:val="20"/>
+                <w:lang w:val="es-ES"/>
+              </w:rPr>
+              <w:lastRenderedPageBreak/>
+              <w:t>aprobada.</w:t>
             </w:r>
           </w:p>
         </w:tc>
@@ -6583,9 +8039,9 @@
           <w:lang w:val="es-ES"/>
         </w:rPr>
         <w:drawing>
-          <wp:inline distT="0" distB="0" distL="0" distR="0" wp14:anchorId="0962EE2F" wp14:editId="06ED63B7">
-            <wp:extent cx="5972810" cy="2837180"/>
-            <wp:effectExtent l="0" t="0" r="8890" b="1270"/>
+          <wp:inline distT="0" distB="0" distL="0" distR="0" wp14:anchorId="0962EE2F" wp14:editId="79650384">
+            <wp:extent cx="6193972" cy="2718313"/>
+            <wp:effectExtent l="0" t="0" r="0" b="6350"/>
             <wp:docPr id="71681432" name="Picture 1"/>
             <wp:cNvGraphicFramePr>
               <a:graphicFrameLocks xmlns:a="http://schemas.openxmlformats.org/drawingml/2006/main" noChangeAspect="1"/>
@@ -6597,20 +8053,29 @@
                     <pic:cNvPr id="71681432" name=""/>
                     <pic:cNvPicPr/>
                   </pic:nvPicPr>
-                  <pic:blipFill>
+                  <pic:blipFill rotWithShape="1">
                     <a:blip r:embed="rId9"/>
+                    <a:srcRect l="3646" t="4221" r="12883" b="18660"/>
                     <a:stretch>
                       <a:fillRect/>
                     </a:stretch>
                   </pic:blipFill>
-                  <pic:spPr>
+                  <pic:spPr bwMode="auto">
                     <a:xfrm>
                       <a:off x="0" y="0"/>
-                      <a:ext cx="5972810" cy="2837180"/>
+                      <a:ext cx="6211113" cy="2725835"/>
                     </a:xfrm>
                     <a:prstGeom prst="rect">
                       <a:avLst/>
                     </a:prstGeom>
+                    <a:ln>
+                      <a:noFill/>
+                    </a:ln>
+                    <a:extLst>
+                      <a:ext uri="{53640926-AAD7-44D8-BBD7-CCE9431645EC}">
+                        <a14:shadowObscured xmlns:a14="http://schemas.microsoft.com/office/drawing/2010/main"/>
+                      </a:ext>
+                    </a:extLst>
                   </pic:spPr>
                 </pic:pic>
               </a:graphicData>
@@ -6641,7 +8106,7 @@
           <w:i/>
           <w:lang w:val="es-ES"/>
         </w:rPr>
-        <w:t>2</w:t>
+        <w:t>3</w:t>
       </w:r>
       <w:r>
         <w:rPr>
@@ -6681,7 +8146,6 @@
         <w:rPr>
           <w:lang w:val="es-ES"/>
         </w:rPr>
-        <w:lastRenderedPageBreak/>
         <w:t>Diagrama de Clases</w:t>
       </w:r>
       <w:bookmarkEnd w:id="16"/>
@@ -6724,6 +8188,7 @@
           <w:noProof/>
           <w:lang w:val="es-ES"/>
         </w:rPr>
+        <w:lastRenderedPageBreak/>
         <w:drawing>
           <wp:inline distT="0" distB="0" distL="0" distR="0" wp14:anchorId="46AB9270" wp14:editId="3F1DB66B">
             <wp:extent cx="5811061" cy="5839640"/>
@@ -6783,7 +8248,7 @@
           <w:i/>
           <w:lang w:val="es-ES"/>
         </w:rPr>
-        <w:t>3</w:t>
+        <w:t>4</w:t>
       </w:r>
       <w:r>
         <w:rPr>
@@ -6854,8 +8319,29 @@
           <w:szCs w:val="28"/>
           <w:lang w:val="es-ES"/>
         </w:rPr>
-        <w:lastRenderedPageBreak/>
-        <w:t>Panel Administrador (FormAdmin)</w:t>
+        <w:t>Panel Administrador (</w:t>
+      </w:r>
+      <w:proofErr w:type="spellStart"/>
+      <w:r>
+        <w:rPr>
+          <w:rFonts w:eastAsia="Arial" w:cstheme="majorHAnsi"/>
+          <w:color w:val="1A1A28"/>
+          <w:sz w:val="28"/>
+          <w:szCs w:val="28"/>
+          <w:lang w:val="es-ES"/>
+        </w:rPr>
+        <w:t>FormAdmin</w:t>
+      </w:r>
+      <w:proofErr w:type="spellEnd"/>
+      <w:r>
+        <w:rPr>
+          <w:rFonts w:eastAsia="Arial" w:cstheme="majorHAnsi"/>
+          <w:color w:val="1A1A28"/>
+          <w:sz w:val="28"/>
+          <w:szCs w:val="28"/>
+          <w:lang w:val="es-ES"/>
+        </w:rPr>
+        <w:t>)</w:t>
       </w:r>
       <w:bookmarkEnd w:id="19"/>
       <w:bookmarkEnd w:id="20"/>
@@ -6874,14 +8360,118 @@
           <w:color w:val="2C2C2C"/>
           <w:lang w:val="es-ES"/>
         </w:rPr>
-        <w:t xml:space="preserve">El FormAdmin utiliza un sidebar lateral con UserControls cargados dinámicamente en el panelContenido central. </w:t>
-      </w:r>
+        <w:t xml:space="preserve">El </w:t>
+      </w:r>
+      <w:proofErr w:type="spellStart"/>
       <w:r>
         <w:rPr>
           <w:rFonts w:asciiTheme="majorHAnsi" w:eastAsia="Arial" w:hAnsiTheme="majorHAnsi" w:cstheme="majorHAnsi"/>
           <w:color w:val="2C2C2C"/>
-        </w:rPr>
-        <w:t>Las secciones accesibles son:</w:t>
+          <w:lang w:val="es-ES"/>
+        </w:rPr>
+        <w:t>FormAdmin</w:t>
+      </w:r>
+      <w:proofErr w:type="spellEnd"/>
+      <w:r>
+        <w:rPr>
+          <w:rFonts w:asciiTheme="majorHAnsi" w:eastAsia="Arial" w:hAnsiTheme="majorHAnsi" w:cstheme="majorHAnsi"/>
+          <w:color w:val="2C2C2C"/>
+          <w:lang w:val="es-ES"/>
+        </w:rPr>
+        <w:t xml:space="preserve"> utiliza un </w:t>
+      </w:r>
+      <w:proofErr w:type="spellStart"/>
+      <w:r>
+        <w:rPr>
+          <w:rFonts w:asciiTheme="majorHAnsi" w:eastAsia="Arial" w:hAnsiTheme="majorHAnsi" w:cstheme="majorHAnsi"/>
+          <w:color w:val="2C2C2C"/>
+          <w:lang w:val="es-ES"/>
+        </w:rPr>
+        <w:t>sidebar</w:t>
+      </w:r>
+      <w:proofErr w:type="spellEnd"/>
+      <w:r>
+        <w:rPr>
+          <w:rFonts w:asciiTheme="majorHAnsi" w:eastAsia="Arial" w:hAnsiTheme="majorHAnsi" w:cstheme="majorHAnsi"/>
+          <w:color w:val="2C2C2C"/>
+          <w:lang w:val="es-ES"/>
+        </w:rPr>
+        <w:t xml:space="preserve"> lateral con </w:t>
+      </w:r>
+      <w:proofErr w:type="spellStart"/>
+      <w:r>
+        <w:rPr>
+          <w:rFonts w:asciiTheme="majorHAnsi" w:eastAsia="Arial" w:hAnsiTheme="majorHAnsi" w:cstheme="majorHAnsi"/>
+          <w:color w:val="2C2C2C"/>
+          <w:lang w:val="es-ES"/>
+        </w:rPr>
+        <w:t>UserControls</w:t>
+      </w:r>
+      <w:proofErr w:type="spellEnd"/>
+      <w:r>
+        <w:rPr>
+          <w:rFonts w:asciiTheme="majorHAnsi" w:eastAsia="Arial" w:hAnsiTheme="majorHAnsi" w:cstheme="majorHAnsi"/>
+          <w:color w:val="2C2C2C"/>
+          <w:lang w:val="es-ES"/>
+        </w:rPr>
+        <w:t xml:space="preserve"> cargados dinámicamente en el </w:t>
+      </w:r>
+      <w:proofErr w:type="spellStart"/>
+      <w:r>
+        <w:rPr>
+          <w:rFonts w:asciiTheme="majorHAnsi" w:eastAsia="Arial" w:hAnsiTheme="majorHAnsi" w:cstheme="majorHAnsi"/>
+          <w:color w:val="2C2C2C"/>
+          <w:lang w:val="es-ES"/>
+        </w:rPr>
+        <w:t>panelContenido</w:t>
+      </w:r>
+      <w:proofErr w:type="spellEnd"/>
+      <w:r>
+        <w:rPr>
+          <w:rFonts w:asciiTheme="majorHAnsi" w:eastAsia="Arial" w:hAnsiTheme="majorHAnsi" w:cstheme="majorHAnsi"/>
+          <w:color w:val="2C2C2C"/>
+          <w:lang w:val="es-ES"/>
+        </w:rPr>
+        <w:t xml:space="preserve"> central. </w:t>
+      </w:r>
+      <w:r>
+        <w:rPr>
+          <w:rFonts w:asciiTheme="majorHAnsi" w:eastAsia="Arial" w:hAnsiTheme="majorHAnsi" w:cstheme="majorHAnsi"/>
+          <w:color w:val="2C2C2C"/>
+        </w:rPr>
+        <w:t xml:space="preserve">Las </w:t>
+      </w:r>
+      <w:proofErr w:type="spellStart"/>
+      <w:r>
+        <w:rPr>
+          <w:rFonts w:asciiTheme="majorHAnsi" w:eastAsia="Arial" w:hAnsiTheme="majorHAnsi" w:cstheme="majorHAnsi"/>
+          <w:color w:val="2C2C2C"/>
+        </w:rPr>
+        <w:t>secciones</w:t>
+      </w:r>
+      <w:proofErr w:type="spellEnd"/>
+      <w:r>
+        <w:rPr>
+          <w:rFonts w:asciiTheme="majorHAnsi" w:eastAsia="Arial" w:hAnsiTheme="majorHAnsi" w:cstheme="majorHAnsi"/>
+          <w:color w:val="2C2C2C"/>
+        </w:rPr>
+        <w:t xml:space="preserve"> </w:t>
+      </w:r>
+      <w:proofErr w:type="spellStart"/>
+      <w:r>
+        <w:rPr>
+          <w:rFonts w:asciiTheme="majorHAnsi" w:eastAsia="Arial" w:hAnsiTheme="majorHAnsi" w:cstheme="majorHAnsi"/>
+          <w:color w:val="2C2C2C"/>
+        </w:rPr>
+        <w:t>accesibles</w:t>
+      </w:r>
+      <w:proofErr w:type="spellEnd"/>
+      <w:r>
+        <w:rPr>
+          <w:rFonts w:asciiTheme="majorHAnsi" w:eastAsia="Arial" w:hAnsiTheme="majorHAnsi" w:cstheme="majorHAnsi"/>
+          <w:color w:val="2C2C2C"/>
+        </w:rPr>
+        <w:t xml:space="preserve"> son:</w:t>
       </w:r>
     </w:p>
     <w:p>
@@ -6918,7 +8508,23 @@
           <w:rFonts w:asciiTheme="majorHAnsi" w:eastAsia="Arial" w:hAnsiTheme="majorHAnsi" w:cstheme="majorHAnsi"/>
           <w:color w:val="2C2C2C"/>
         </w:rPr>
-        <w:t>Vista CRUD completa.</w:t>
+        <w:t xml:space="preserve">Vista CRUD </w:t>
+      </w:r>
+      <w:proofErr w:type="spellStart"/>
+      <w:r>
+        <w:rPr>
+          <w:rFonts w:asciiTheme="majorHAnsi" w:eastAsia="Arial" w:hAnsiTheme="majorHAnsi" w:cstheme="majorHAnsi"/>
+          <w:color w:val="2C2C2C"/>
+        </w:rPr>
+        <w:t>completa</w:t>
+      </w:r>
+      <w:proofErr w:type="spellEnd"/>
+      <w:r>
+        <w:rPr>
+          <w:rFonts w:asciiTheme="majorHAnsi" w:eastAsia="Arial" w:hAnsiTheme="majorHAnsi" w:cstheme="majorHAnsi"/>
+          <w:color w:val="2C2C2C"/>
+        </w:rPr>
+        <w:t>.</w:t>
       </w:r>
     </w:p>
     <w:p>
@@ -6941,6 +8547,7 @@
           <w:color w:val="2C2C2C"/>
           <w:lang w:val="es-ES"/>
         </w:rPr>
+        <w:lastRenderedPageBreak/>
         <w:t>Departamentos: gestión de áreas de la empresa y asignación de empleados.</w:t>
       </w:r>
     </w:p>
@@ -7010,7 +8617,25 @@
           <w:color w:val="2C2C2C"/>
           <w:lang w:val="es-ES"/>
         </w:rPr>
-        <w:t>Mi Perfil: datos personales del administrador logueado.</w:t>
+        <w:t xml:space="preserve">Mi Perfil: datos personales del administrador </w:t>
+      </w:r>
+      <w:proofErr w:type="spellStart"/>
+      <w:r>
+        <w:rPr>
+          <w:rFonts w:asciiTheme="majorHAnsi" w:eastAsia="Arial" w:hAnsiTheme="majorHAnsi" w:cstheme="majorHAnsi"/>
+          <w:color w:val="2C2C2C"/>
+          <w:lang w:val="es-ES"/>
+        </w:rPr>
+        <w:t>logueado</w:t>
+      </w:r>
+      <w:proofErr w:type="spellEnd"/>
+      <w:r>
+        <w:rPr>
+          <w:rFonts w:asciiTheme="majorHAnsi" w:eastAsia="Arial" w:hAnsiTheme="majorHAnsi" w:cstheme="majorHAnsi"/>
+          <w:color w:val="2C2C2C"/>
+          <w:lang w:val="es-ES"/>
+        </w:rPr>
+        <w:t>.</w:t>
       </w:r>
     </w:p>
     <w:p>
@@ -7131,7 +8756,7 @@
           <w:i/>
           <w:lang w:val="es-ES"/>
         </w:rPr>
-        <w:t>4</w:t>
+        <w:t>5</w:t>
       </w:r>
       <w:r>
         <w:rPr>
@@ -7246,7 +8871,7 @@
           <w:i/>
           <w:lang w:val="es-ES"/>
         </w:rPr>
-        <w:t>5</w:t>
+        <w:t>6</w:t>
       </w:r>
       <w:r>
         <w:rPr>
@@ -7360,7 +8985,7 @@
           <w:i/>
           <w:lang w:val="es-ES"/>
         </w:rPr>
-        <w:t>6</w:t>
+        <w:t>7</w:t>
       </w:r>
       <w:r>
         <w:rPr>
@@ -7475,7 +9100,7 @@
           <w:i/>
           <w:lang w:val="es-ES"/>
         </w:rPr>
-        <w:t>7</w:t>
+        <w:t>8</w:t>
       </w:r>
       <w:r>
         <w:rPr>
@@ -7489,8 +9114,17 @@
           <w:i/>
           <w:lang w:val="es-ES"/>
         </w:rPr>
-        <w:t>Módulo de Vacacionesl</w:t>
-      </w:r>
+        <w:t xml:space="preserve">Módulo de </w:t>
+      </w:r>
+      <w:proofErr w:type="spellStart"/>
+      <w:r>
+        <w:rPr>
+          <w:i/>
+          <w:lang w:val="es-ES"/>
+        </w:rPr>
+        <w:t>Vacacionesl</w:t>
+      </w:r>
+      <w:proofErr w:type="spellEnd"/>
       <w:r>
         <w:rPr>
           <w:i/>
@@ -7589,7 +9223,7 @@
           <w:i/>
           <w:lang w:val="es-ES"/>
         </w:rPr>
-        <w:t>8</w:t>
+        <w:t>9</w:t>
       </w:r>
       <w:r>
         <w:rPr>
@@ -7668,7 +9302,29 @@
           <w:szCs w:val="32"/>
           <w:lang w:val="es-ES"/>
         </w:rPr>
-        <w:t>Panel Empleado (FormEmpleado)</w:t>
+        <w:t>Panel Empleado (</w:t>
+      </w:r>
+      <w:proofErr w:type="spellStart"/>
+      <w:r>
+        <w:rPr>
+          <w:rFonts w:eastAsia="Arial" w:cstheme="majorHAnsi"/>
+          <w:color w:val="1A1A28"/>
+          <w:sz w:val="32"/>
+          <w:szCs w:val="32"/>
+          <w:lang w:val="es-ES"/>
+        </w:rPr>
+        <w:t>FormEmpleado</w:t>
+      </w:r>
+      <w:proofErr w:type="spellEnd"/>
+      <w:r>
+        <w:rPr>
+          <w:rFonts w:eastAsia="Arial" w:cstheme="majorHAnsi"/>
+          <w:color w:val="1A1A28"/>
+          <w:sz w:val="32"/>
+          <w:szCs w:val="32"/>
+          <w:lang w:val="es-ES"/>
+        </w:rPr>
+        <w:t>)</w:t>
       </w:r>
       <w:bookmarkEnd w:id="21"/>
       <w:bookmarkEnd w:id="22"/>
@@ -7687,14 +9343,64 @@
           <w:color w:val="2C2C2C"/>
           <w:lang w:val="es-ES"/>
         </w:rPr>
-        <w:t xml:space="preserve">El FormEmpleado sigue la misma estructura de navegación. </w:t>
-      </w:r>
+        <w:t xml:space="preserve">El </w:t>
+      </w:r>
+      <w:proofErr w:type="spellStart"/>
       <w:r>
         <w:rPr>
           <w:rFonts w:asciiTheme="majorHAnsi" w:eastAsia="Arial" w:hAnsiTheme="majorHAnsi" w:cstheme="majorHAnsi"/>
           <w:color w:val="2C2C2C"/>
-        </w:rPr>
-        <w:t>Las secciones accesibles son:</w:t>
+          <w:lang w:val="es-ES"/>
+        </w:rPr>
+        <w:t>FormEmpleado</w:t>
+      </w:r>
+      <w:proofErr w:type="spellEnd"/>
+      <w:r>
+        <w:rPr>
+          <w:rFonts w:asciiTheme="majorHAnsi" w:eastAsia="Arial" w:hAnsiTheme="majorHAnsi" w:cstheme="majorHAnsi"/>
+          <w:color w:val="2C2C2C"/>
+          <w:lang w:val="es-ES"/>
+        </w:rPr>
+        <w:t xml:space="preserve"> sigue la misma estructura de navegación. </w:t>
+      </w:r>
+      <w:r>
+        <w:rPr>
+          <w:rFonts w:asciiTheme="majorHAnsi" w:eastAsia="Arial" w:hAnsiTheme="majorHAnsi" w:cstheme="majorHAnsi"/>
+          <w:color w:val="2C2C2C"/>
+        </w:rPr>
+        <w:t xml:space="preserve">Las </w:t>
+      </w:r>
+      <w:proofErr w:type="spellStart"/>
+      <w:r>
+        <w:rPr>
+          <w:rFonts w:asciiTheme="majorHAnsi" w:eastAsia="Arial" w:hAnsiTheme="majorHAnsi" w:cstheme="majorHAnsi"/>
+          <w:color w:val="2C2C2C"/>
+        </w:rPr>
+        <w:t>secciones</w:t>
+      </w:r>
+      <w:proofErr w:type="spellEnd"/>
+      <w:r>
+        <w:rPr>
+          <w:rFonts w:asciiTheme="majorHAnsi" w:eastAsia="Arial" w:hAnsiTheme="majorHAnsi" w:cstheme="majorHAnsi"/>
+          <w:color w:val="2C2C2C"/>
+        </w:rPr>
+        <w:t xml:space="preserve"> </w:t>
+      </w:r>
+      <w:proofErr w:type="spellStart"/>
+      <w:r>
+        <w:rPr>
+          <w:rFonts w:asciiTheme="majorHAnsi" w:eastAsia="Arial" w:hAnsiTheme="majorHAnsi" w:cstheme="majorHAnsi"/>
+          <w:color w:val="2C2C2C"/>
+        </w:rPr>
+        <w:t>accesibles</w:t>
+      </w:r>
+      <w:proofErr w:type="spellEnd"/>
+      <w:r>
+        <w:rPr>
+          <w:rFonts w:asciiTheme="majorHAnsi" w:eastAsia="Arial" w:hAnsiTheme="majorHAnsi" w:cstheme="majorHAnsi"/>
+          <w:color w:val="2C2C2C"/>
+        </w:rPr>
+        <w:t xml:space="preserve"> son:</w:t>
       </w:r>
     </w:p>
     <w:p>
@@ -7719,13 +9425,23 @@
           <w:lang w:val="es-ES"/>
         </w:rPr>
       </w:pPr>
+      <w:proofErr w:type="spellStart"/>
       <w:r>
         <w:rPr>
           <w:rFonts w:asciiTheme="majorHAnsi" w:eastAsia="Arial" w:hAnsiTheme="majorHAnsi" w:cstheme="majorHAnsi"/>
           <w:color w:val="2C2C2C"/>
           <w:lang w:val="es-ES"/>
         </w:rPr>
-        <w:t>Dashboard: resumen del mes actual (horas trabajadas, días de vacaciones disponibles, última nómina).</w:t>
+        <w:t>Dashboard</w:t>
+      </w:r>
+      <w:proofErr w:type="spellEnd"/>
+      <w:r>
+        <w:rPr>
+          <w:rFonts w:asciiTheme="majorHAnsi" w:eastAsia="Arial" w:hAnsiTheme="majorHAnsi" w:cstheme="majorHAnsi"/>
+          <w:color w:val="2C2C2C"/>
+          <w:lang w:val="es-ES"/>
+        </w:rPr>
+        <w:t>: resumen del mes actual (horas trabajadas, días de vacaciones disponibles, última nómina).</w:t>
       </w:r>
     </w:p>
     <w:p>
@@ -7833,11 +9549,19 @@
           <w:lang w:val="es-ES"/>
         </w:rPr>
       </w:pPr>
-      <w:r>
-        <w:rPr>
-          <w:lang w:val="es-ES"/>
-        </w:rPr>
-        <w:t>DashBoard:</w:t>
+      <w:proofErr w:type="spellStart"/>
+      <w:r>
+        <w:rPr>
+          <w:lang w:val="es-ES"/>
+        </w:rPr>
+        <w:t>DashBoard</w:t>
+      </w:r>
+      <w:proofErr w:type="spellEnd"/>
+      <w:r>
+        <w:rPr>
+          <w:lang w:val="es-ES"/>
+        </w:rPr>
+        <w:t>:</w:t>
       </w:r>
     </w:p>
     <w:p>
@@ -7910,7 +9634,7 @@
           <w:i/>
           <w:lang w:val="es-ES"/>
         </w:rPr>
-        <w:t>9</w:t>
+        <w:t>10</w:t>
       </w:r>
       <w:r>
         <w:rPr>
@@ -8025,13 +9749,20 @@
           <w:i/>
           <w:lang w:val="es-ES"/>
         </w:rPr>
-        <w:t>10</w:t>
+        <w:t>1</w:t>
       </w:r>
       <w:r>
         <w:rPr>
           <w:i/>
           <w:lang w:val="es-ES"/>
         </w:rPr>
+        <w:t>1</w:t>
+      </w:r>
+      <w:r>
+        <w:rPr>
+          <w:i/>
+          <w:lang w:val="es-ES"/>
+        </w:rPr>
         <w:t xml:space="preserve">. </w:t>
       </w:r>
       <w:r>
@@ -8039,8 +9770,17 @@
           <w:i/>
           <w:lang w:val="es-ES"/>
         </w:rPr>
-        <w:t>Módulo de Fichajes Elmpleado</w:t>
-      </w:r>
+        <w:t xml:space="preserve">Módulo de Fichajes </w:t>
+      </w:r>
+      <w:proofErr w:type="spellStart"/>
+      <w:r>
+        <w:rPr>
+          <w:i/>
+          <w:lang w:val="es-ES"/>
+        </w:rPr>
+        <w:t>Elmpleado</w:t>
+      </w:r>
+      <w:proofErr w:type="spellEnd"/>
       <w:r>
         <w:rPr>
           <w:i/>
@@ -8077,9 +9817,44 @@
       </w:pPr>
       <w:r>
         <w:rPr>
-          <w:lang w:val="es-ES"/>
-        </w:rPr>
-        <w:t>En proceso…</w:t>
+          <w:noProof/>
+          <w:lang w:val="es-ES"/>
+        </w:rPr>
+        <w:drawing>
+          <wp:inline distT="0" distB="0" distL="0" distR="0" wp14:anchorId="01E0B173" wp14:editId="5D6B454D">
+            <wp:extent cx="5972810" cy="3211830"/>
+            <wp:effectExtent l="0" t="0" r="8890" b="7620"/>
+            <wp:docPr id="800467106" name="Picture 1" descr="A screenshot of a computer&#10;&#10;AI-generated content may be incorrect."/>
+            <wp:cNvGraphicFramePr>
+              <a:graphicFrameLocks xmlns:a="http://schemas.openxmlformats.org/drawingml/2006/main" noChangeAspect="1"/>
+            </wp:cNvGraphicFramePr>
+            <a:graphic xmlns:a="http://schemas.openxmlformats.org/drawingml/2006/main">
+              <a:graphicData uri="http://schemas.openxmlformats.org/drawingml/2006/picture">
+                <pic:pic xmlns:pic="http://schemas.openxmlformats.org/drawingml/2006/picture">
+                  <pic:nvPicPr>
+                    <pic:cNvPr id="800467106" name="Picture 1" descr="A screenshot of a computer&#10;&#10;AI-generated content may be incorrect."/>
+                    <pic:cNvPicPr/>
+                  </pic:nvPicPr>
+                  <pic:blipFill>
+                    <a:blip r:embed="rId18"/>
+                    <a:stretch>
+                      <a:fillRect/>
+                    </a:stretch>
+                  </pic:blipFill>
+                  <pic:spPr>
+                    <a:xfrm>
+                      <a:off x="0" y="0"/>
+                      <a:ext cx="5972810" cy="3211830"/>
+                    </a:xfrm>
+                    <a:prstGeom prst="rect">
+                      <a:avLst/>
+                    </a:prstGeom>
+                  </pic:spPr>
+                </pic:pic>
+              </a:graphicData>
+            </a:graphic>
+          </wp:inline>
+        </w:drawing>
       </w:r>
     </w:p>
     <w:p>
@@ -8104,7 +9879,14 @@
           <w:i/>
           <w:lang w:val="es-ES"/>
         </w:rPr>
-        <w:t>11</w:t>
+        <w:t>1</w:t>
+      </w:r>
+      <w:r>
+        <w:rPr>
+          <w:i/>
+          <w:lang w:val="es-ES"/>
+        </w:rPr>
+        <w:t>2</w:t>
       </w:r>
       <w:r>
         <w:rPr>
@@ -8159,7 +9941,6 @@
           <w:noProof/>
           <w:lang w:val="es-ES"/>
         </w:rPr>
-        <w:lastRenderedPageBreak/>
         <w:drawing>
           <wp:inline distT="0" distB="0" distL="0" distR="0" wp14:anchorId="45DD6BFA" wp14:editId="21B8A557">
             <wp:extent cx="5972810" cy="3206115"/>
@@ -8176,7 +9957,7 @@
                     <pic:cNvPicPr/>
                   </pic:nvPicPr>
                   <pic:blipFill>
-                    <a:blip r:embed="rId18"/>
+                    <a:blip r:embed="rId19"/>
                     <a:stretch>
                       <a:fillRect/>
                     </a:stretch>
@@ -8219,7 +10000,14 @@
           <w:i/>
           <w:lang w:val="es-ES"/>
         </w:rPr>
-        <w:t>12</w:t>
+        <w:t>1</w:t>
+      </w:r>
+      <w:r>
+        <w:rPr>
+          <w:i/>
+          <w:lang w:val="es-ES"/>
+        </w:rPr>
+        <w:t>3</w:t>
       </w:r>
       <w:r>
         <w:rPr>
@@ -8298,7 +10086,14 @@
           <w:i/>
           <w:lang w:val="es-ES"/>
         </w:rPr>
-        <w:t>13</w:t>
+        <w:t>1</w:t>
+      </w:r>
+      <w:r>
+        <w:rPr>
+          <w:i/>
+          <w:lang w:val="es-ES"/>
+        </w:rPr>
+        <w:t>4</w:t>
       </w:r>
       <w:r>
         <w:rPr>
@@ -8337,9 +10132,11 @@
           <w:numId w:val="21"/>
         </w:numPr>
       </w:pPr>
+      <w:proofErr w:type="spellStart"/>
       <w:r>
         <w:t>Antecedentes</w:t>
       </w:r>
+      <w:proofErr w:type="spellEnd"/>
     </w:p>
     <w:p/>
     <w:p>
@@ -8361,11 +10158,26 @@
           <w:lang w:val="es-ES"/>
         </w:rPr>
       </w:pPr>
-      <w:r>
-        <w:rPr>
-          <w:lang w:val="es-ES"/>
-        </w:rPr>
-        <w:t>AppRRHH nace como respuesta a esta necesidad, ofreciendo una solución centralizada que permite gestionar toda la información de los empleados desde una única aplicación de escritorio. El objetivo no es competir con grandes soluciones empresariales como SAP o Factorial, sino ofrecer una herramienta sencilla, funcional y fácil de usar para empresas pequeñas.</w:t>
+      <w:proofErr w:type="spellStart"/>
+      <w:r>
+        <w:rPr>
+          <w:lang w:val="es-ES"/>
+        </w:rPr>
+        <w:t>AppRRHH</w:t>
+      </w:r>
+      <w:proofErr w:type="spellEnd"/>
+      <w:r>
+        <w:rPr>
+          <w:lang w:val="es-ES"/>
+        </w:rPr>
+        <w:t xml:space="preserve"> nace como respuesta a esta necesidad, ofreciendo una solución centralizada que permite gestionar toda la información de los empleados desde una única aplicación de escritorio. El objetivo no </w:t>
+      </w:r>
+      <w:r>
+        <w:rPr>
+          <w:lang w:val="es-ES"/>
+        </w:rPr>
+        <w:lastRenderedPageBreak/>
+        <w:t>es competir con grandes soluciones empresariales como SAP o Factorial, sino ofrecer una herramienta sencilla, funcional y fácil de usar para empresas pequeñas.</w:t>
       </w:r>
     </w:p>
     <w:p>
@@ -8378,7 +10190,49 @@
         <w:rPr>
           <w:lang w:val="es-ES"/>
         </w:rPr>
-        <w:t>Como referencias técnicas se utilizó la documentación oficial de Microsoft para Entity Framework Core y Windows Forms, así como la documentación de MaterialSkin 2 para el diseño de la interfaz.</w:t>
+        <w:t xml:space="preserve">Como referencias técnicas se utilizó la documentación oficial de Microsoft para </w:t>
+      </w:r>
+      <w:proofErr w:type="spellStart"/>
+      <w:r>
+        <w:rPr>
+          <w:lang w:val="es-ES"/>
+        </w:rPr>
+        <w:t>Entity</w:t>
+      </w:r>
+      <w:proofErr w:type="spellEnd"/>
+      <w:r>
+        <w:rPr>
+          <w:lang w:val="es-ES"/>
+        </w:rPr>
+        <w:t xml:space="preserve"> Framework Core y Windows </w:t>
+      </w:r>
+      <w:proofErr w:type="spellStart"/>
+      <w:r>
+        <w:rPr>
+          <w:lang w:val="es-ES"/>
+        </w:rPr>
+        <w:t>Forms</w:t>
+      </w:r>
+      <w:proofErr w:type="spellEnd"/>
+      <w:r>
+        <w:rPr>
+          <w:lang w:val="es-ES"/>
+        </w:rPr>
+        <w:t xml:space="preserve">, así como la documentación de </w:t>
+      </w:r>
+      <w:proofErr w:type="spellStart"/>
+      <w:r>
+        <w:rPr>
+          <w:lang w:val="es-ES"/>
+        </w:rPr>
+        <w:t>MaterialSkin</w:t>
+      </w:r>
+      <w:proofErr w:type="spellEnd"/>
+      <w:r>
+        <w:rPr>
+          <w:lang w:val="es-ES"/>
+        </w:rPr>
+        <w:t xml:space="preserve"> 2 para el diseño de la interfaz.</w:t>
       </w:r>
     </w:p>
     <w:p>
@@ -8396,8 +10250,13 @@
           <w:numId w:val="21"/>
         </w:numPr>
       </w:pPr>
-      <w:r>
-        <w:t>Gestión del Proyecto – GitHub</w:t>
+      <w:proofErr w:type="spellStart"/>
+      <w:r>
+        <w:t>Gestión</w:t>
+      </w:r>
+      <w:proofErr w:type="spellEnd"/>
+      <w:r>
+        <w:t xml:space="preserve"> del Proyecto – GitHub</w:t>
       </w:r>
     </w:p>
     <w:p/>
@@ -8417,7 +10276,21 @@
         <w:rPr>
           <w:lang w:val="es-ES"/>
         </w:rPr>
-        <w:t>ediante Git con repositorio en GitHub. Se ha seguido una estrategia de ramas por módulo, creando una rama independiente para cada funcionalidad desarrollada: rama para el módulo de empleados, rama para nóminas, rama para vacaciones, rama para fichajes y rama para la interfaz de usuario. Las ramas se han fusionado a la rama principal main una vez validado el funcionamiento de cada módulo.</w:t>
+        <w:t xml:space="preserve">ediante Git con repositorio en GitHub. Se ha seguido una estrategia de ramas por módulo, creando una rama independiente para cada funcionalidad desarrollada: rama para el módulo de empleados, rama para nóminas, rama para vacaciones, rama para fichajes y rama para la interfaz de usuario. Las ramas se han fusionado a la rama principal </w:t>
+      </w:r>
+      <w:proofErr w:type="spellStart"/>
+      <w:r>
+        <w:rPr>
+          <w:lang w:val="es-ES"/>
+        </w:rPr>
+        <w:t>main</w:t>
+      </w:r>
+      <w:proofErr w:type="spellEnd"/>
+      <w:r>
+        <w:rPr>
+          <w:lang w:val="es-ES"/>
+        </w:rPr>
+        <w:t xml:space="preserve"> una vez validado el funcionamiento de cada módulo.</w:t>
       </w:r>
     </w:p>
     <w:p>
@@ -8540,11 +10413,19 @@
                 <w:lang w:val="es-ES"/>
               </w:rPr>
             </w:pPr>
+            <w:proofErr w:type="spellStart"/>
             <w:r>
               <w:rPr>
                 <w:lang w:val="es-ES"/>
               </w:rPr>
-              <w:t>Login y autenticación</w:t>
+              <w:t>Login</w:t>
+            </w:r>
+            <w:proofErr w:type="spellEnd"/>
+            <w:r>
+              <w:rPr>
+                <w:lang w:val="es-ES"/>
+              </w:rPr>
+              <w:t xml:space="preserve"> y autenticación</w:t>
             </w:r>
           </w:p>
         </w:tc>
@@ -8900,9 +10781,19 @@
           <w:numId w:val="21"/>
         </w:numPr>
       </w:pPr>
-      <w:r>
-        <w:t>Mejoras Futuras</w:t>
-      </w:r>
+      <w:proofErr w:type="spellStart"/>
+      <w:r>
+        <w:t>Mejoras</w:t>
+      </w:r>
+      <w:proofErr w:type="spellEnd"/>
+      <w:r>
+        <w:t xml:space="preserve"> </w:t>
+      </w:r>
+      <w:proofErr w:type="spellStart"/>
+      <w:r>
+        <w:t>Futuras</w:t>
+      </w:r>
+      <w:proofErr w:type="spellEnd"/>
     </w:p>
     <w:p>
       <w:pPr>
@@ -8914,7 +10805,21 @@
         <w:rPr>
           <w:lang w:val="es-ES"/>
         </w:rPr>
-        <w:t>Durante el desarrollo de AppRRHH se han identificado varias mejoras que podrían implementarse en futuras versiones:</w:t>
+        <w:t xml:space="preserve">Durante el desarrollo de </w:t>
+      </w:r>
+      <w:proofErr w:type="spellStart"/>
+      <w:r>
+        <w:rPr>
+          <w:lang w:val="es-ES"/>
+        </w:rPr>
+        <w:t>AppRRHH</w:t>
+      </w:r>
+      <w:proofErr w:type="spellEnd"/>
+      <w:r>
+        <w:rPr>
+          <w:lang w:val="es-ES"/>
+        </w:rPr>
+        <w:t xml:space="preserve"> se han identificado varias mejoras que podrían implementarse en futuras versiones:</w:t>
       </w:r>
     </w:p>
     <w:p>
@@ -8935,13 +10840,59 @@
           <w:bCs/>
           <w:lang w:val="es-ES"/>
         </w:rPr>
-        <w:t>Migración completa a MaterialSkin 2</w:t>
-      </w:r>
-      <w:r>
-        <w:rPr>
-          <w:lang w:val="es-ES"/>
-        </w:rPr>
-        <w:t xml:space="preserve"> — aunque se incorporó la librería, su uso quedó limitado a MaterialCard y MaterialButton debido a problemas de compatibilidad con .NET 8. En futuras versiones se plantea migrar todos los controles para conseguir una interfaz más consistente. </w:t>
+        <w:t xml:space="preserve">Migración completa a </w:t>
+      </w:r>
+      <w:proofErr w:type="spellStart"/>
+      <w:r>
+        <w:rPr>
+          <w:b/>
+          <w:bCs/>
+          <w:lang w:val="es-ES"/>
+        </w:rPr>
+        <w:t>MaterialSkin</w:t>
+      </w:r>
+      <w:proofErr w:type="spellEnd"/>
+      <w:r>
+        <w:rPr>
+          <w:b/>
+          <w:bCs/>
+          <w:lang w:val="es-ES"/>
+        </w:rPr>
+        <w:t xml:space="preserve"> 2</w:t>
+      </w:r>
+      <w:r>
+        <w:rPr>
+          <w:lang w:val="es-ES"/>
+        </w:rPr>
+        <w:t xml:space="preserve"> — aunque se incorporó la librería, su uso quedó limitado a </w:t>
+      </w:r>
+      <w:proofErr w:type="spellStart"/>
+      <w:r>
+        <w:rPr>
+          <w:lang w:val="es-ES"/>
+        </w:rPr>
+        <w:t>MaterialCard</w:t>
+      </w:r>
+      <w:proofErr w:type="spellEnd"/>
+      <w:r>
+        <w:rPr>
+          <w:lang w:val="es-ES"/>
+        </w:rPr>
+        <w:t xml:space="preserve"> y </w:t>
+      </w:r>
+      <w:proofErr w:type="spellStart"/>
+      <w:r>
+        <w:rPr>
+          <w:lang w:val="es-ES"/>
+        </w:rPr>
+        <w:t>MaterialButton</w:t>
+      </w:r>
+      <w:proofErr w:type="spellEnd"/>
+      <w:r>
+        <w:rPr>
+          <w:lang w:val="es-ES"/>
+        </w:rPr>
+        <w:t xml:space="preserve"> debido a problemas de compatibilidad con .NET 8. En futuras versiones se plantea migrar todos los controles para conseguir una interfaz más consistente. </w:t>
       </w:r>
     </w:p>
     <w:p>
@@ -8989,33 +10940,7 @@
           <w:bCs/>
           <w:lang w:val="es-ES"/>
         </w:rPr>
-        <w:t>Corrección de claves foráneas</w:t>
-      </w:r>
-      <w:r>
-        <w:rPr>
-          <w:lang w:val="es-ES"/>
-        </w:rPr>
-        <w:t xml:space="preserve"> — establecer correctamente las relaciones entre entidades en la base de datos para poder aprovechar al máximo las capacidades de Entity Framework Core. </w:t>
-      </w:r>
-    </w:p>
-    <w:p>
-      <w:pPr>
-        <w:pStyle w:val="ListBullet"/>
-        <w:tabs>
-          <w:tab w:val="clear" w:pos="360"/>
-          <w:tab w:val="num" w:pos="720"/>
-        </w:tabs>
-        <w:ind w:left="720"/>
-        <w:rPr>
-          <w:lang w:val="es-ES"/>
-        </w:rPr>
-      </w:pPr>
-      <w:r>
-        <w:rPr>
-          <w:b/>
-          <w:bCs/>
-          <w:lang w:val="es-ES"/>
-        </w:rPr>
+        <w:lastRenderedPageBreak/>
         <w:t>Notificaciones</w:t>
       </w:r>
       <w:r>
@@ -9033,10 +10958,19 @@
           <w:numId w:val="21"/>
         </w:numPr>
       </w:pPr>
-      <w:r>
-        <w:lastRenderedPageBreak/>
-        <w:t>Dificultades Encontradas</w:t>
-      </w:r>
+      <w:proofErr w:type="spellStart"/>
+      <w:r>
+        <w:t>Dificultades</w:t>
+      </w:r>
+      <w:proofErr w:type="spellEnd"/>
+      <w:r>
+        <w:t xml:space="preserve"> </w:t>
+      </w:r>
+      <w:proofErr w:type="spellStart"/>
+      <w:r>
+        <w:t>Encontradas</w:t>
+      </w:r>
+      <w:proofErr w:type="spellEnd"/>
     </w:p>
     <w:p/>
     <w:p>
@@ -9068,13 +11002,69 @@
         <w:rPr>
           <w:lang w:val="es-ES"/>
         </w:rPr>
-        <w:t>Una de las principales dificultades del proyecto fue el diseño de la interfaz gráfica. Al trabajar con Windows Forms, un framework que no dispone de herramientas de diseño tan avanzadas como las aplicaciones web, resultó complejo conseguir</w:t>
-      </w:r>
-      <w:r>
-        <w:rPr>
-          <w:lang w:val="es-ES"/>
-        </w:rPr>
-        <w:t xml:space="preserve"> una apariencia moderna y profesional. La lección de colores, tamaños y posiciones de los colores ha requerido muchas iteraciones hasta encontrar un resultado consistente y atractivo. Para solucionar esto decidí incorporar la librería materialSkin 2, que proporciona controles con estilo material Design, aunque su integración con .NET 8 generó problemas de estabilidad provocaban cierres inesperados de la aplicación al cargar módulos con muchos controles simultáneamente.</w:t>
+        <w:t xml:space="preserve">Una de las principales dificultades del proyecto fue el diseño de la interfaz gráfica. Al trabajar con Windows </w:t>
+      </w:r>
+      <w:proofErr w:type="spellStart"/>
+      <w:r>
+        <w:rPr>
+          <w:lang w:val="es-ES"/>
+        </w:rPr>
+        <w:t>Forms</w:t>
+      </w:r>
+      <w:proofErr w:type="spellEnd"/>
+      <w:r>
+        <w:rPr>
+          <w:lang w:val="es-ES"/>
+        </w:rPr>
+        <w:t xml:space="preserve">, un </w:t>
+      </w:r>
+      <w:proofErr w:type="spellStart"/>
+      <w:r>
+        <w:rPr>
+          <w:lang w:val="es-ES"/>
+        </w:rPr>
+        <w:t>framework</w:t>
+      </w:r>
+      <w:proofErr w:type="spellEnd"/>
+      <w:r>
+        <w:rPr>
+          <w:lang w:val="es-ES"/>
+        </w:rPr>
+        <w:t xml:space="preserve"> que no dispone de herramientas de diseño tan avanzadas como las aplicaciones web, resultó complejo conseguir</w:t>
+      </w:r>
+      <w:r>
+        <w:rPr>
+          <w:lang w:val="es-ES"/>
+        </w:rPr>
+        <w:t xml:space="preserve"> una apariencia moderna y profesional. La lección de colores, tamaños y posiciones de los colores ha requerido muchas iteraciones hasta encontrar un resultado consistente y atractivo. Para solucionar esto decidí incorporar la librería </w:t>
+      </w:r>
+      <w:proofErr w:type="spellStart"/>
+      <w:r>
+        <w:rPr>
+          <w:lang w:val="es-ES"/>
+        </w:rPr>
+        <w:t>materialSkin</w:t>
+      </w:r>
+      <w:proofErr w:type="spellEnd"/>
+      <w:r>
+        <w:rPr>
+          <w:lang w:val="es-ES"/>
+        </w:rPr>
+        <w:t xml:space="preserve"> 2, que proporciona controles con estilo material </w:t>
+      </w:r>
+      <w:proofErr w:type="spellStart"/>
+      <w:r>
+        <w:rPr>
+          <w:lang w:val="es-ES"/>
+        </w:rPr>
+        <w:t>Design</w:t>
+      </w:r>
+      <w:proofErr w:type="spellEnd"/>
+      <w:r>
+        <w:rPr>
+          <w:lang w:val="es-ES"/>
+        </w:rPr>
+        <w:t>, aunque su integración con .NET 8 generó problemas de estabilidad provocaban cierres inesperados de la aplicación al cargar módulos con muchos controles simultáneamente.</w:t>
       </w:r>
     </w:p>
     <w:p>
@@ -9089,7 +11079,21 @@
         <w:rPr>
           <w:lang w:val="es-ES"/>
         </w:rPr>
-        <w:t>También resultó complejo mantener la consistencia visual entre todos los módulos de la aplicación, ya que cada UserControl se desarrolló de forma independiente y fue necesario unificar fuentes, colores y estilos a lo largo de todo el proyecto.</w:t>
+        <w:t xml:space="preserve">También resultó complejo mantener la consistencia visual entre todos los módulos de la aplicación, ya que cada </w:t>
+      </w:r>
+      <w:proofErr w:type="spellStart"/>
+      <w:r>
+        <w:rPr>
+          <w:lang w:val="es-ES"/>
+        </w:rPr>
+        <w:t>UserControl</w:t>
+      </w:r>
+      <w:proofErr w:type="spellEnd"/>
+      <w:r>
+        <w:rPr>
+          <w:lang w:val="es-ES"/>
+        </w:rPr>
+        <w:t xml:space="preserve"> se desarrolló de forma independiente y fue necesario unificar fuentes, colores y estilos a lo largo de todo el proyecto.</w:t>
       </w:r>
     </w:p>
     <w:p>
@@ -9139,9 +11143,11 @@
           <w:numId w:val="21"/>
         </w:numPr>
       </w:pPr>
+      <w:proofErr w:type="spellStart"/>
       <w:r>
         <w:t>Conclusión</w:t>
       </w:r>
+      <w:proofErr w:type="spellEnd"/>
     </w:p>
     <w:p/>
     <w:p>
@@ -9154,13 +11160,55 @@
         <w:rPr>
           <w:lang w:val="es-ES"/>
         </w:rPr>
-        <w:t>El Desarrollo de AppRRHH h</w:t>
-      </w:r>
-      <w:r>
-        <w:rPr>
-          <w:lang w:val="es-ES"/>
-        </w:rPr>
-        <w:t>a sido un proyecto exigente que me ha permitido aplicar de forma práctica los conocimientos adquiridos durante el curso. A lo largo del desarrollo he aprendido a estructurar una aplicación en capas, a gestionar una base de datos relacional con Entity Framework Core y a construir una interfaz de usuario completa con Windows Forms.</w:t>
+        <w:t xml:space="preserve">El Desarrollo de </w:t>
+      </w:r>
+      <w:proofErr w:type="spellStart"/>
+      <w:r>
+        <w:rPr>
+          <w:lang w:val="es-ES"/>
+        </w:rPr>
+        <w:t>AppRRHH</w:t>
+      </w:r>
+      <w:proofErr w:type="spellEnd"/>
+      <w:r>
+        <w:rPr>
+          <w:lang w:val="es-ES"/>
+        </w:rPr>
+        <w:t xml:space="preserve"> h</w:t>
+      </w:r>
+      <w:r>
+        <w:rPr>
+          <w:lang w:val="es-ES"/>
+        </w:rPr>
+        <w:t xml:space="preserve">a sido un proyecto exigente que me ha permitido aplicar de forma práctica los conocimientos adquiridos durante el curso. A lo largo del desarrollo he aprendido a estructurar una aplicación en capas, a gestionar una base de datos relacional con </w:t>
+      </w:r>
+      <w:proofErr w:type="spellStart"/>
+      <w:r>
+        <w:rPr>
+          <w:lang w:val="es-ES"/>
+        </w:rPr>
+        <w:t>Entity</w:t>
+      </w:r>
+      <w:proofErr w:type="spellEnd"/>
+      <w:r>
+        <w:rPr>
+          <w:lang w:val="es-ES"/>
+        </w:rPr>
+        <w:t xml:space="preserve"> Framework Core y a construir una interfaz de usuario completa con Windows </w:t>
+      </w:r>
+      <w:proofErr w:type="spellStart"/>
+      <w:r>
+        <w:rPr>
+          <w:lang w:val="es-ES"/>
+        </w:rPr>
+        <w:t>Forms</w:t>
+      </w:r>
+      <w:proofErr w:type="spellEnd"/>
+      <w:r>
+        <w:rPr>
+          <w:lang w:val="es-ES"/>
+        </w:rPr>
+        <w:t>.</w:t>
       </w:r>
     </w:p>
     <w:p>
@@ -9186,7 +11234,21 @@
         <w:rPr>
           <w:lang w:val="es-ES"/>
         </w:rPr>
-        <w:t>También he aprendido a resolver problemas técnicos de forma autónoma, especialmente los relacionados con la compatibilidad entre MaterialSkin 2 y .NET 8, que han requerido investigar y encontrar soluciones alternativas cuando el enfoque inicial no funcionaba.</w:t>
+        <w:t xml:space="preserve">También he aprendido a resolver problemas técnicos de forma autónoma, especialmente los relacionados con la compatibilidad entre </w:t>
+      </w:r>
+      <w:proofErr w:type="spellStart"/>
+      <w:r>
+        <w:rPr>
+          <w:lang w:val="es-ES"/>
+        </w:rPr>
+        <w:t>MaterialSkin</w:t>
+      </w:r>
+      <w:proofErr w:type="spellEnd"/>
+      <w:r>
+        <w:rPr>
+          <w:lang w:val="es-ES"/>
+        </w:rPr>
+        <w:t xml:space="preserve"> 2 y .NET 8, que han requerido investigar y encontrar soluciones alternativas cuando el enfoque inicial no funcionaba.</w:t>
       </w:r>
     </w:p>
     <w:p>
@@ -9199,6 +11261,7 @@
         <w:rPr>
           <w:lang w:val="es-ES"/>
         </w:rPr>
+        <w:lastRenderedPageBreak/>
         <w:t>En general, este proyecto me ha dado una visión real de cómo se desarrolla una aplicación de escritorio de principio a fin, desde el modelado de datos hasta la interfaz de usuario, pasando por la lógica de negocio. Me ha aportado confianza y experiencia práctica que considero muy valiosa para mi futuro profesional como desarrollador.</w:t>
       </w:r>
     </w:p>
@@ -11683,6 +13746,7 @@
   <w:style w:type="character" w:default="1" w:styleId="DefaultParagraphFont">
     <w:name w:val="Default Paragraph Font"/>
     <w:uiPriority w:val="1"/>
+    <w:semiHidden/>
     <w:unhideWhenUsed/>
   </w:style>
   <w:style w:type="table" w:default="1" w:styleId="TableNormal">

</xml_diff>